<commit_message>
Status note 2026-10-11; updated service caller workflow and config
- docs/HARNESS_ENGINEERING_CURRENT_STATE_KEY_DECISIONS.docx: BUILT
  #16-#21 (clarification learning), operating rule (answer on base, then
  resume), new key decisions, ten-phase spine, resolved/updated open
  decisions and known limitations, merge + v1 retag + BCBSM sync steps.
- docs/examples/SDLC-Harness.yml: toolkit_proposals input (default
  false), repo_instructions in start_phase options, optional
  TOOLKIT_PR_TOKEN, v1 retag note.
- docs/examples/config.yaml: repo_instructions skill and scope, learning
  settings (load/manage copilot-instructions, decisions, knowledge).

Co-Authored-By: Claude Opus 5.5 <noreply@anthropic.com>
Claude-Session: https://claude.ai/code/session_013bELyoNPPr1pVLZG4rTVUY
</commit_message>
<xml_diff>
--- a/docs/HARNESS_ENGINEERING_CURRENT_STATE_KEY_DECISIONS.docx
+++ b/docs/HARNESS_ENGINEERING_CURRENT_STATE_KEY_DECISIONS.docx
@@ -4,7 +4,7 @@
   <w:body>
     <w:p>
       <w:r>
-        <w:t xml:space="preserve">HARNESS ENGINEERING — CURRENT STATE &amp; KEY DECISIONS (Canonical status note. Keep this current as things change — it is the source of truth for status.) Last updated: 2026-10-10.</w:t>
+        <w:t xml:space="preserve">HARNESS ENGINEERING — CURRENT STATE &amp; KEY DECISIONS (Canonical status note. Keep this current as things change — it is the source of truth for status.) Last updated: 2026-10-11.</w:t>
       </w:r>
     </w:p>
     <w:p>
@@ -51,15 +51,7 @@
         </w:numPr>
       </w:pPr>
       <w:r>
-        <w:t xml:space="preserve">Toolkit: </w:t>
-      </w:r>
-      <w:proofErr w:type="spellStart"/>
-      <w:r>
-        <w:t>mgganeshguptha</w:t>
-      </w:r>
-      <w:proofErr w:type="spellEnd"/>
-      <w:r>
-        <w:t>-source/copilot-toolkit (skills + instruction files)</w:t>
+        <w:t xml:space="preserve">Toolkit: mgganeshguptha-source/copilot-toolkit (skills + instruction files)</w:t>
       </w:r>
     </w:p>
     <w:p>
@@ -81,31 +73,7 @@
         </w:numPr>
       </w:pPr>
       <w:r>
-        <w:t xml:space="preserve">Demo service: </w:t>
-      </w:r>
-      <w:proofErr w:type="spellStart"/>
-      <w:r>
-        <w:t>mgganeshguptha</w:t>
-      </w:r>
-      <w:proofErr w:type="spellEnd"/>
-      <w:r>
-        <w:t>-source/harness-demo-spring-</w:t>
-      </w:r>
-      <w:proofErr w:type="spellStart"/>
-      <w:r>
-        <w:t>petclinic</w:t>
-      </w:r>
-      <w:proofErr w:type="spellEnd"/>
-      <w:r>
-        <w:t xml:space="preserve"> (flattened Spring </w:t>
-      </w:r>
-      <w:proofErr w:type="spellStart"/>
-      <w:r>
-        <w:t>PetClinic</w:t>
-      </w:r>
-      <w:proofErr w:type="spellEnd"/>
-      <w:r>
-        <w:t>) BCBSM pilot clones:</w:t>
+        <w:t xml:space="preserve">Demo service: mgganeshguptha-source/harness-demo-spring-petclinic (flattened Spring PetClinic) BCBSM pilot clones:</w:t>
       </w:r>
     </w:p>
     <w:p>
@@ -116,15 +84,7 @@
         </w:numPr>
       </w:pPr>
       <w:r>
-        <w:t>Engine: BCBSM/</w:t>
-      </w:r>
-      <w:proofErr w:type="spellStart"/>
-      <w:r>
-        <w:t>dx_SDLC</w:t>
-      </w:r>
-      <w:proofErr w:type="spellEnd"/>
-      <w:r>
-        <w:t>-Harness (private)</w:t>
+        <w:t>Engine: BCBSM/dx_SDLC-Harness (private)</w:t>
       </w:r>
     </w:p>
     <w:p>
@@ -135,15 +95,7 @@
         </w:numPr>
       </w:pPr>
       <w:r>
-        <w:t>Toolkit: BCBSM/</w:t>
-      </w:r>
-      <w:proofErr w:type="spellStart"/>
-      <w:r>
-        <w:t>dx_copilot</w:t>
-      </w:r>
-      <w:proofErr w:type="spellEnd"/>
-      <w:r>
-        <w:t>-standards-workspace (default branch: master)</w:t>
+        <w:t>Toolkit: BCBSM/dx_copilot-standards-workspace (default branch: master)</w:t>
       </w:r>
     </w:p>
     <w:p>
@@ -154,15 +106,7 @@
         </w:numPr>
       </w:pPr>
       <w:r>
-        <w:t xml:space="preserve">First service: </w:t>
-      </w:r>
-      <w:proofErr w:type="spellStart"/>
-      <w:r>
-        <w:t>dx_mex</w:t>
-      </w:r>
-      <w:proofErr w:type="spellEnd"/>
-      <w:r>
-        <w:t>-coverage-service (only branch: master; base = master)</w:t>
+        <w:t xml:space="preserve">First service: dx_mex-coverage-service (only branch: master; base = master)</w:t>
       </w:r>
     </w:p>
     <w:p>
@@ -173,11 +117,39 @@
         </w:rPr>
       </w:pPr>
       <w:r>
+        <w:t xml:space="preserve">===================================================================== CURRENT STATE (updated 2026-10-11 — clarification learning built; build/test restored; library store)</w:t>
+      </w:r>
+    </w:p>
+    <w:p>
+      <w:pPr>
+        <w:numPr>
+          <w:ilvl w:val="0"/>
+          <w:numId w:val="2"/>
+        </w:numPr>
+      </w:pPr>
+      <w:pPr>
         <w:rPr>
           <w:b/>
           <w:bCs/>
         </w:rPr>
-        <w:t xml:space="preserve">===================================================================== CURRENT STATE (updated 2026-10-10 — build/test restored; library store)</w:t>
+      </w:pPr>
+      <w:r>
+        <w:rPr>
+          <w:b/>
+          <w:bCs/>
+        </w:rPr>
+        <w:t xml:space="preserve">CLARIFICATION LEARNING BUILT (#16–#21), NOT YET MERGED: on branch claude/awesome-mccarthy-bboco5 in mgganeshguptha-source/SDLC-Harness and mgganeshguptha-source/copilot-toolkit. Unit-tested only (19 new tests); not yet run in CI; not in main, v1 or BCBSM. Goal: a question answered once is not asked again — same developer or anyone else, any later story — and the answers also reach developers working stories outside the harness (about half of stories) through .github/copilot-instructions.md. See SHIPPED — BUILT #16–#21.</w:t>
+      </w:r>
+    </w:p>
+    <w:p>
+      <w:pPr>
+        <w:numPr>
+          <w:ilvl w:val="0"/>
+          <w:numId w:val="2"/>
+        </w:numPr>
+      </w:pPr>
+      <w:r>
+        <w:t xml:space="preserve">OPERATING RULE (from 2026-10-11): after a halt in the context phase (clarification questions), developers answer in the story file on the BASE branch and RESUME (resume=true) — not a fresh run. The resume re-reads the story from the base branch and passes the earlier questions to the context phase.</w:t>
       </w:r>
     </w:p>
     <w:p>
@@ -269,39 +241,7 @@
         </w:numPr>
       </w:pPr>
       <w:r>
-        <w:t>Baseline: a FULL GREEN RUN on harness-demo-spring-</w:t>
-      </w:r>
-      <w:proofErr w:type="spellStart"/>
-      <w:r>
-        <w:t>petclinic</w:t>
-      </w:r>
-      <w:proofErr w:type="spellEnd"/>
-      <w:r>
-        <w:t xml:space="preserve"> (story: add </w:t>
-      </w:r>
-      <w:proofErr w:type="spellStart"/>
-      <w:r>
-        <w:t>Owner.hasPets</w:t>
-      </w:r>
-      <w:proofErr w:type="spellEnd"/>
-      <w:r>
-        <w:t xml:space="preserve">(); all nine phases; PR #1 into </w:t>
-      </w:r>
-      <w:proofErr w:type="spellStart"/>
-      <w:r>
-        <w:t>PM_Sep</w:t>
-      </w:r>
-      <w:proofErr w:type="spellEnd"/>
-      <w:r>
-        <w:t xml:space="preserve">; gpt-5.4 for most phases, claude-haiku-4.5 for </w:t>
-      </w:r>
-      <w:proofErr w:type="spellStart"/>
-      <w:r>
-        <w:t>code_review</w:t>
-      </w:r>
-      <w:proofErr w:type="spellEnd"/>
-      <w:r>
-        <w:t>). Demo to BCBSM architects went well; their two change requests are DONE (BUILT #2, #5).</w:t>
+        <w:t xml:space="preserve">Baseline: a FULL GREEN RUN on harness-demo-spring-petclinic (story: add Owner.hasPets(); all nine phases; PR #1 into PM_Sep; gpt-5.4 for most phases, claude-haiku-4.5 for code_review). Demo to BCBSM architects went well; their two change requests are DONE (BUILT #2, #5).</w:t>
       </w:r>
     </w:p>
     <w:p>
@@ -312,47 +252,7 @@
         </w:numPr>
       </w:pPr>
       <w:r>
-        <w:t>BCBSM story OP018-6418 (</w:t>
-      </w:r>
-      <w:proofErr w:type="spellStart"/>
-      <w:r>
-        <w:t>dx_mex</w:t>
-      </w:r>
-      <w:proofErr w:type="spellEnd"/>
-      <w:r>
-        <w:t xml:space="preserve">-coverage-service, </w:t>
-      </w:r>
-      <w:proofErr w:type="spellStart"/>
-      <w:r>
-        <w:t>visitSummary</w:t>
-      </w:r>
-      <w:proofErr w:type="spellEnd"/>
-      <w:r>
-        <w:t xml:space="preserve"> status fix): halted in CONTEXT three times on [NEEDS CLARIFICATION]. After the build-context skill tightening (BUILT #8) the context phase passed with no further clarification. The run then reached validation and halted on ENVIRONMENT FAILURE (exit 126 — </w:t>
-      </w:r>
-      <w:proofErr w:type="spellStart"/>
-      <w:r>
-        <w:t>mvnw</w:t>
-      </w:r>
-      <w:proofErr w:type="spellEnd"/>
-      <w:r>
-        <w:t xml:space="preserve"> stored as 100644). Fixed by the </w:t>
-      </w:r>
-      <w:proofErr w:type="spellStart"/>
-      <w:r>
-        <w:t>chmod</w:t>
-      </w:r>
-      <w:proofErr w:type="spellEnd"/>
-      <w:r>
-        <w:t xml:space="preserve"> step in </w:t>
-      </w:r>
-      <w:proofErr w:type="spellStart"/>
-      <w:r>
-        <w:t>harness.yml</w:t>
-      </w:r>
-      <w:proofErr w:type="spellEnd"/>
-      <w:r>
-        <w:t xml:space="preserve"> (BUILT #7).</w:t>
+        <w:t xml:space="preserve">BCBSM story OP018-6418 (dx_mex-coverage-service, visitSummary status fix): halted in CONTEXT three times on [NEEDS CLARIFICATION]. After the build-context skill tightening (BUILT #8) the context phase passed with no further clarification. The run then reached validation and halted on ENVIRONMENT FAILURE (exit 126 — mvnw stored as 100644). Fixed by the chmod step in harness.yml (BUILT #7).</w:t>
       </w:r>
     </w:p>
     <w:p>
@@ -363,23 +263,7 @@
         </w:numPr>
       </w:pPr>
       <w:r>
-        <w:t xml:space="preserve">v1 re-tag (2026-09-25/26): moving v1 from bb6a5bd to master brought in the BUILT #6 engine files AND a replacement </w:t>
-      </w:r>
-      <w:proofErr w:type="spellStart"/>
-      <w:r>
-        <w:t>harness.yml</w:t>
-      </w:r>
-      <w:proofErr w:type="spellEnd"/>
-      <w:r>
-        <w:t xml:space="preserve"> that had lost the BCBSM wiring (no engine-checkout token, no copilot-requests, no COPILOT_MODEL_TOKEN). Runs then failed first at engine checkout ("could not read Username"), then in context with a classic-PAT 400. Corrected </w:t>
-      </w:r>
-      <w:proofErr w:type="spellStart"/>
-      <w:r>
-        <w:t>harness.yml</w:t>
-      </w:r>
-      <w:proofErr w:type="spellEnd"/>
-      <w:r>
-        <w:t xml:space="preserve"> = BUILT #7.</w:t>
+        <w:t xml:space="preserve">v1 re-tag (2026-09-25/26): moving v1 from bb6a5bd to master brought in the BUILT #6 engine files AND a replacement harness.yml that had lost the BCBSM wiring (no engine-checkout token, no copilot-requests, no COPILOT_MODEL_TOKEN). Runs then failed first at engine checkout ("could not read Username"), then in context with a classic-PAT 400. Corrected harness.yml = BUILT #7.</w:t>
       </w:r>
     </w:p>
     <w:p>
@@ -401,15 +285,7 @@
         </w:numPr>
       </w:pPr>
       <w:r>
-        <w:t xml:space="preserve">VERIFIED on the 2026-09-26 run: engine checkout succeeds with the token; the SDK metrics path is live — log shows [cost] ... (source: </w:t>
-      </w:r>
-      <w:proofErr w:type="spellStart"/>
-      <w:r>
-        <w:t>session_metrics</w:t>
-      </w:r>
-      <w:proofErr w:type="spellEnd"/>
-      <w:r>
-        <w:t>).</w:t>
+        <w:t xml:space="preserve">VERIFIED on the 2026-09-26 run: engine checkout succeeds with the token; the SDK metrics path is live — log shows [cost] ... (source: session_metrics).</w:t>
       </w:r>
     </w:p>
     <w:p>
@@ -421,23 +297,7 @@
       </w:pPr>
       <w:r>
         <w:lastRenderedPageBreak/>
-        <w:t xml:space="preserve">NOT YET VERIFIED: a full run on the corrected </w:t>
-      </w:r>
-      <w:proofErr w:type="spellStart"/>
-      <w:r>
-        <w:t>harness.yml</w:t>
-      </w:r>
-      <w:proofErr w:type="spellEnd"/>
-      <w:r>
-        <w:t xml:space="preserve">; Actions-token model calls on this engine version ([auth] line should show </w:t>
-      </w:r>
-      <w:proofErr w:type="spellStart"/>
-      <w:r>
-        <w:t>ghs</w:t>
-      </w:r>
-      <w:proofErr w:type="spellEnd"/>
-      <w:r>
-        <w:t>_); nano-AIU reconciliation against the org billing report.</w:t>
+        <w:t xml:space="preserve">NOT YET VERIFIED: a full run on the corrected harness.yml; Actions-token model calls on this engine version ([auth] line should show ghs_); nano-AIU reconciliation against the org billing report.</w:t>
       </w:r>
     </w:p>
     <w:p>
@@ -463,15 +323,7 @@
         </w:numPr>
       </w:pPr>
       <w:r>
-        <w:t>Engine (SDLC-Harness): Python engine + the reusable workflow (</w:t>
-      </w:r>
-      <w:proofErr w:type="spellStart"/>
-      <w:r>
-        <w:t>harness.yml</w:t>
-      </w:r>
-      <w:proofErr w:type="spellEnd"/>
-      <w:r>
-        <w:t>).</w:t>
+        <w:t>Engine (SDLC-Harness): Python engine + the reusable workflow (harness.yml).</w:t>
       </w:r>
     </w:p>
     <w:p>
@@ -482,15 +334,7 @@
         </w:numPr>
       </w:pPr>
       <w:r>
-        <w:t>Toolkit: skills + instruction files. Fetched fresh at run time; copied into service/.</w:t>
-      </w:r>
-      <w:proofErr w:type="spellStart"/>
-      <w:r>
-        <w:t>github</w:t>
-      </w:r>
-      <w:proofErr w:type="spellEnd"/>
-      <w:r>
-        <w:t xml:space="preserve"> at run time; never committed into the service repo's branches.</w:t>
+        <w:t xml:space="preserve">Toolkit: skills + instruction files. Fetched fresh at run time; copied into service/.github at run time; never committed into the service repo's branches.</w:t>
       </w:r>
     </w:p>
     <w:p>
@@ -501,87 +345,18 @@
         </w:numPr>
       </w:pPr>
       <w:r>
-        <w:t>Service repo: caller workflow (.</w:t>
-      </w:r>
-      <w:proofErr w:type="spellStart"/>
-      <w:r>
-        <w:t>github</w:t>
-      </w:r>
-      <w:proofErr w:type="spellEnd"/>
-      <w:r>
-        <w:t>/workflows/SDLC-</w:t>
-      </w:r>
-      <w:proofErr w:type="spellStart"/>
-      <w:r>
-        <w:t>Harness.yml</w:t>
-      </w:r>
-      <w:proofErr w:type="spellEnd"/>
-      <w:r>
-        <w:t>) + .harness/</w:t>
-      </w:r>
-      <w:proofErr w:type="spellStart"/>
-      <w:r>
-        <w:t>config.yaml</w:t>
-      </w:r>
-      <w:proofErr w:type="spellEnd"/>
-      <w:r>
-        <w:t xml:space="preserve"> + the code.</w:t>
-      </w:r>
-    </w:p>
-    <w:p>
-      <w:r>
-        <w:t>Runner layout per run: service/ (code, from base), engine/ (engine), toolkit/ (</w:t>
-      </w:r>
-      <w:proofErr w:type="spellStart"/>
-      <w:r>
-        <w:t>skills+instructions</w:t>
-      </w:r>
-      <w:proofErr w:type="spellEnd"/>
-      <w:r>
-        <w:t>, copied into service/.</w:t>
-      </w:r>
-      <w:proofErr w:type="spellStart"/>
-      <w:r>
-        <w:t>github</w:t>
-      </w:r>
-      <w:proofErr w:type="spellEnd"/>
-      <w:r>
-        <w:t xml:space="preserve"> for the SDK).</w:t>
-      </w:r>
-    </w:p>
-    <w:p>
-      <w:r>
-        <w:t xml:space="preserve">NINE PHASES context -&gt; design (by exception) -&gt; </w:t>
-      </w:r>
-      <w:proofErr w:type="spellStart"/>
-      <w:r>
-        <w:t>prompt_steps</w:t>
-      </w:r>
-      <w:proofErr w:type="spellEnd"/>
-      <w:r>
-        <w:t xml:space="preserve"> -&gt; coding -&gt; </w:t>
-      </w:r>
-      <w:proofErr w:type="spellStart"/>
-      <w:r>
-        <w:t>code_review</w:t>
-      </w:r>
-      <w:proofErr w:type="spellEnd"/>
-      <w:r>
-        <w:t xml:space="preserve"> -&gt; </w:t>
-      </w:r>
-      <w:proofErr w:type="spellStart"/>
-      <w:r>
-        <w:t>unit_testing</w:t>
-      </w:r>
-      <w:proofErr w:type="spellEnd"/>
-      <w:r>
-        <w:t xml:space="preserve"> -&gt; validation -&gt; documentation -&gt; </w:t>
-      </w:r>
-      <w:proofErr w:type="spellStart"/>
-      <w:r>
-        <w:t>raise_pr</w:t>
-      </w:r>
-      <w:proofErr w:type="spellEnd"/>
+        <w:t xml:space="preserve">Service repo: caller workflow (.github/workflows/SDLC-Harness.yml) + .harness/config.yaml + the code.</w:t>
+      </w:r>
+    </w:p>
+    <w:p>
+      <w:r>
+        <w:t xml:space="preserve">Runner layout per run: service/ (code, from base), engine/ (engine), toolkit/ (skills+instructions, copied into service/.github for the SDK).</w:t>
+      </w:r>
+    </w:p>
+    <w:p>
+      <w:r>
+        <w:t xml:space="preserve">TEN PHASES repo_instructions (by exception: only when .github/copilot-instructions.md is missing) -&gt; context -&gt; design (by exception) -&gt; prompt_steps -&gt; coding -&gt; code_review -&gt; unit_testing -&gt; validation -&gt; documentation -&gt; raise_pr</w:t>
+      </w:r>
     </w:p>
     <w:p>
       <w:r>
@@ -596,15 +371,7 @@
         </w:numPr>
       </w:pPr>
       <w:r>
-        <w:t xml:space="preserve">Context gate: [NEEDS CLARIFICATION] always blocks; feasibility per </w:t>
-      </w:r>
-      <w:proofErr w:type="spellStart"/>
-      <w:r>
-        <w:t>blocker_gate</w:t>
-      </w:r>
-      <w:proofErr w:type="spellEnd"/>
-      <w:r>
-        <w:t>.</w:t>
+        <w:t xml:space="preserve">Context gate: [NEEDS CLARIFICATION] always blocks; feasibility per blocker_gate.</w:t>
       </w:r>
     </w:p>
     <w:p>
@@ -670,15 +437,7 @@
         </w:numPr>
       </w:pPr>
       <w:r>
-        <w:t>Coverage gate: coverage bar on changed classes (</w:t>
-      </w:r>
-      <w:proofErr w:type="spellStart"/>
-      <w:r>
-        <w:t>min_coverage</w:t>
-      </w:r>
-      <w:proofErr w:type="spellEnd"/>
-      <w:r>
-        <w:t>).</w:t>
+        <w:t>Coverage gate: coverage bar on changed classes (min_coverage).</w:t>
       </w:r>
     </w:p>
     <w:p>
@@ -689,15 +448,7 @@
         </w:numPr>
       </w:pPr>
       <w:r>
-        <w:t xml:space="preserve">AC conformance gate (the validation phase): per-criterion verdicts. Control limits: per-phase iteration cap (phases.py, 4-12); per-gate retries (2 each: review/coverage/AC); global </w:t>
-      </w:r>
-      <w:proofErr w:type="spellStart"/>
-      <w:r>
-        <w:t>max_phase_runs</w:t>
-      </w:r>
-      <w:proofErr w:type="spellEnd"/>
-      <w:r>
-        <w:t xml:space="preserve"> (3) across all loop types.</w:t>
+        <w:t xml:space="preserve">AC conformance gate (the validation phase): per-criterion verdicts. Control limits: per-phase iteration cap (phases.py, 4-12); per-gate retries (2 each: review/coverage/AC); global max_phase_runs (3) across all loop types.</w:t>
       </w:r>
     </w:p>
     <w:p>
@@ -713,23 +464,7 @@
         </w:numPr>
       </w:pPr>
       <w:r>
-        <w:t>Validation GATE = runs tests (</w:t>
-      </w:r>
-      <w:proofErr w:type="spellStart"/>
-      <w:r>
-        <w:t>validate_after</w:t>
-      </w:r>
-      <w:proofErr w:type="spellEnd"/>
-      <w:r>
-        <w:t xml:space="preserve"> on </w:t>
-      </w:r>
-      <w:proofErr w:type="spellStart"/>
-      <w:r>
-        <w:t>unit_testing</w:t>
-      </w:r>
-      <w:proofErr w:type="spellEnd"/>
-      <w:r>
-        <w:t>) — validation.py.</w:t>
+        <w:t xml:space="preserve">Validation GATE = runs tests (validate_after on unit_testing) — validation.py.</w:t>
       </w:r>
     </w:p>
     <w:p>
@@ -756,15 +491,7 @@
         </w:numPr>
       </w:pPr>
       <w:r>
-        <w:t>ON HALT: harness-</w:t>
-      </w:r>
-      <w:proofErr w:type="spellStart"/>
-      <w:r>
-        <w:t>wip</w:t>
-      </w:r>
-      <w:proofErr w:type="spellEnd"/>
-      <w:r>
-        <w:t>/&lt;feature&gt; + harness-metrics</w:t>
+        <w:t>ON HALT: harness-wip/&lt;feature&gt; + harness-metrics</w:t>
       </w:r>
     </w:p>
     <w:p>
@@ -775,15 +502,7 @@
         </w:numPr>
       </w:pPr>
       <w:r>
-        <w:t>ON SUCCESS: harness/&lt;feature&gt;/&lt;date&gt;-&lt;</w:t>
-      </w:r>
-      <w:proofErr w:type="spellStart"/>
-      <w:r>
-        <w:t>runid</w:t>
-      </w:r>
-      <w:proofErr w:type="spellEnd"/>
-      <w:r>
-        <w:t>&gt; (PR) + harness-metrics Details:</w:t>
+        <w:t>ON SUCCESS: harness/&lt;feature&gt;/&lt;date&gt;-&lt;runid&gt; (PR) + harness-metrics Details:</w:t>
       </w:r>
     </w:p>
     <w:p>
@@ -794,49 +513,10 @@
         </w:numPr>
       </w:pPr>
       <w:r>
-        <w:t>harness-</w:t>
-      </w:r>
-      <w:proofErr w:type="spellStart"/>
-      <w:r>
-        <w:t>wip</w:t>
-      </w:r>
-      <w:proofErr w:type="spellEnd"/>
-      <w:r>
-        <w:t>/&lt;feature&gt;: resume point, RESUME STATE + SOURCE only. Carries the source tree plus .harness/run-</w:t>
-      </w:r>
-      <w:proofErr w:type="spellStart"/>
-      <w:r>
-        <w:t>state.json</w:t>
-      </w:r>
-      <w:proofErr w:type="spellEnd"/>
-      <w:r>
-        <w:t xml:space="preserve"> + blocked.md (force-added past .</w:t>
-      </w:r>
-      <w:proofErr w:type="spellStart"/>
-      <w:r>
-        <w:t>gitignore</w:t>
-      </w:r>
-      <w:proofErr w:type="spellEnd"/>
-      <w:r>
-        <w:t xml:space="preserve"> so </w:t>
-      </w:r>
-      <w:r>
+        <w:t xml:space="preserve">harness-wip/&lt;feature&gt;: resume point, RESUME STATE + SOURCE only. Carries the source tree plus .harness/run-state.json + blocked.md (force-added past .gitignore so </w:t>
         <w:lastRenderedPageBreak/>
-        <w:t>CI resume works). Does NOT carry the artifact set. Deleted automatically on a clean success (status=done AND PR raised); kept on halt/</w:t>
-      </w:r>
-      <w:proofErr w:type="spellStart"/>
-      <w:r>
-        <w:t>needs_input</w:t>
-      </w:r>
-      <w:proofErr w:type="spellEnd"/>
-      <w:r>
-        <w:t>/</w:t>
-      </w:r>
-      <w:proofErr w:type="gramStart"/>
-      <w:r>
-        <w:t>skipped-PR.</w:t>
-      </w:r>
-      <w:proofErr w:type="gramEnd"/>
+        <w:t>CI resume works). Does NOT carry the artifact set. Deleted automatically on a clean success (status=done AND PR raised); kept on halt/needs_input/skipped-PR.</w:t>
+      </w:r>
     </w:p>
     <w:p>
       <w:pPr>
@@ -846,47 +526,7 @@
         </w:numPr>
       </w:pPr>
       <w:r>
-        <w:t>harness-metrics: the SINGLE long-lived home for metrics AND artifacts, always pushed, accumulates across every run/feature. Layout: metrics/&lt;</w:t>
-      </w:r>
-      <w:proofErr w:type="spellStart"/>
-      <w:r>
-        <w:t>yyyy</w:t>
-      </w:r>
-      <w:proofErr w:type="spellEnd"/>
-      <w:r>
-        <w:t>&gt;/&lt;mm&gt;/&lt;feature&gt;-&lt;</w:t>
-      </w:r>
-      <w:proofErr w:type="spellStart"/>
-      <w:r>
-        <w:t>run_id</w:t>
-      </w:r>
-      <w:proofErr w:type="spellEnd"/>
-      <w:r>
-        <w:t>&gt;.</w:t>
-      </w:r>
-      <w:proofErr w:type="spellStart"/>
-      <w:r>
-        <w:t>json</w:t>
-      </w:r>
-      <w:proofErr w:type="spellEnd"/>
-      <w:r>
-        <w:t xml:space="preserve"> (per-run metrics; schema v3 — per-phase model + SDK-reported per-phase usage and cost) artifacts/&lt;feature&gt;/&lt;</w:t>
-      </w:r>
-      <w:proofErr w:type="spellStart"/>
-      <w:r>
-        <w:t>run_id</w:t>
-      </w:r>
-      <w:proofErr w:type="spellEnd"/>
-      <w:r>
-        <w:t>&gt;/... (audit trail, context files, run-</w:t>
-      </w:r>
-      <w:proofErr w:type="spellStart"/>
-      <w:r>
-        <w:t>state.json</w:t>
-      </w:r>
-      <w:proofErr w:type="spellEnd"/>
-      <w:r>
-        <w:t>, blocked.md — the full run trail) NOT force-push-immutable: anyone with write access can rewrite it. Durable record, not tamper-proof.</w:t>
+        <w:t xml:space="preserve">harness-metrics: the SINGLE long-lived home for metrics AND artifacts, always pushed, accumulates across every run/feature. Layout: metrics/&lt;yyyy&gt;/&lt;mm&gt;/&lt;feature&gt;-&lt;run_id&gt;.json (per-run metrics; schema v3 — per-phase model + SDK-reported per-phase usage and cost) artifacts/&lt;feature&gt;/&lt;run_id&gt;/... (audit trail, context files, run-state.json, blocked.md — the full run trail) NOT force-push-immutable: anyone with write access can rewrite it. Durable record, not tamper-proof.</w:t>
       </w:r>
     </w:p>
     <w:p>
@@ -897,23 +537,7 @@
         </w:numPr>
       </w:pPr>
       <w:r>
-        <w:t>harness/&lt;feature&gt;/&lt;date&gt;-&lt;</w:t>
-      </w:r>
-      <w:proofErr w:type="spellStart"/>
-      <w:r>
-        <w:t>runid</w:t>
-      </w:r>
-      <w:proofErr w:type="spellEnd"/>
-      <w:r>
-        <w:t>&gt;: PR branch, SOURCE-ONLY (</w:t>
-      </w:r>
-      <w:proofErr w:type="spellStart"/>
-      <w:r>
-        <w:t>src</w:t>
-      </w:r>
-      <w:proofErr w:type="spellEnd"/>
-      <w:r>
-        <w:t>/ + docs/), cut clean from origin/&lt;base&gt;. No .harness/, audit/, or metrics/.</w:t>
+        <w:t>harness/&lt;feature&gt;/&lt;date&gt;-&lt;runid&gt;: PR branch, SOURCE-ONLY (src/ + docs/), cut clean from origin/&lt;base&gt;. No .harness/, audit/, or metrics/.</w:t>
       </w:r>
     </w:p>
     <w:p>
@@ -950,15 +574,7 @@
         </w:numPr>
       </w:pPr>
       <w:r>
-        <w:t xml:space="preserve">Caller workflow lives on the default </w:t>
-      </w:r>
-      <w:proofErr w:type="gramStart"/>
-      <w:r>
-        <w:t>branch</w:t>
-      </w:r>
-      <w:proofErr w:type="gramEnd"/>
-      <w:r>
-        <w:t xml:space="preserve"> so the button appears in Actions; it calls the engine reusable workflow at @v1. "Use workflow from" selects the service-repo branch holding the CALLER workflow — not the engine version (that is the v1 tag).</w:t>
+        <w:t xml:space="preserve">Caller workflow lives on the default branch so the button appears in Actions; it calls the engine reusable workflow at @v1. "Use workflow from" selects the service-repo branch holding the CALLER workflow — not the engine version (that is the v1 tag).</w:t>
       </w:r>
     </w:p>
     <w:p>
@@ -991,79 +607,7 @@
         </w:numPr>
       </w:pPr>
       <w:r>
-        <w:t xml:space="preserve">Caller </w:t>
-      </w:r>
-      <w:proofErr w:type="gramStart"/>
-      <w:r>
-        <w:t>with:</w:t>
-      </w:r>
-      <w:proofErr w:type="gramEnd"/>
-      <w:r>
-        <w:t xml:space="preserve"> must set </w:t>
-      </w:r>
-      <w:proofErr w:type="spellStart"/>
-      <w:r>
-        <w:t>engine_repo</w:t>
-      </w:r>
-      <w:proofErr w:type="spellEnd"/>
-      <w:r>
-        <w:t xml:space="preserve"> and </w:t>
-      </w:r>
-      <w:proofErr w:type="spellStart"/>
-      <w:r>
-        <w:t>toolkit_repo</w:t>
-      </w:r>
-      <w:proofErr w:type="spellEnd"/>
-      <w:r>
-        <w:t xml:space="preserve"> (owner/repo) — the engine defaults are YOUR-ORG placeholders — and </w:t>
-      </w:r>
-      <w:proofErr w:type="spellStart"/>
-      <w:r>
-        <w:t>toolkit_ref</w:t>
-      </w:r>
-      <w:proofErr w:type="spellEnd"/>
-      <w:r>
-        <w:t xml:space="preserve"> when the toolkit's default branch is not main. BCBSM: </w:t>
-      </w:r>
-      <w:proofErr w:type="spellStart"/>
-      <w:r>
-        <w:t>engine_repo</w:t>
-      </w:r>
-      <w:proofErr w:type="spellEnd"/>
-      <w:r>
-        <w:t>: BCBSM/</w:t>
-      </w:r>
-      <w:proofErr w:type="spellStart"/>
-      <w:r>
-        <w:t>dx_SDLC</w:t>
-      </w:r>
-      <w:proofErr w:type="spellEnd"/>
-      <w:r>
-        <w:t xml:space="preserve">-Harness </w:t>
-      </w:r>
-      <w:proofErr w:type="spellStart"/>
-      <w:r>
-        <w:t>toolkit_repo</w:t>
-      </w:r>
-      <w:proofErr w:type="spellEnd"/>
-      <w:r>
-        <w:t>: BCBSM/</w:t>
-      </w:r>
-      <w:proofErr w:type="spellStart"/>
-      <w:r>
-        <w:t>dx_copilot</w:t>
-      </w:r>
-      <w:proofErr w:type="spellEnd"/>
-      <w:r>
-        <w:t xml:space="preserve">-standards-workspace </w:t>
-      </w:r>
-      <w:proofErr w:type="spellStart"/>
-      <w:r>
-        <w:t>toolkit_ref</w:t>
-      </w:r>
-      <w:proofErr w:type="spellEnd"/>
-      <w:r>
-        <w:t>: master</w:t>
+        <w:t xml:space="preserve">Caller with: must set engine_repo and toolkit_repo (owner/repo) — the engine defaults are YOUR-ORG placeholders — and toolkit_ref when the toolkit's default branch is not main. BCBSM: engine_repo: BCBSM/dx_SDLC-Harness toolkit_repo: BCBSM/dx_copilot-standards-workspace toolkit_ref: master</w:t>
       </w:r>
     </w:p>
     <w:p>
@@ -1176,29 +720,8 @@
           <w:numId w:val="8"/>
         </w:numPr>
       </w:pPr>
-      <w:proofErr w:type="spellStart"/>
-      <w:r>
-        <w:t>phase_skills</w:t>
-      </w:r>
-      <w:proofErr w:type="spellEnd"/>
-      <w:r>
-        <w:t xml:space="preserve"> / </w:t>
-      </w:r>
-      <w:proofErr w:type="spellStart"/>
-      <w:r>
-        <w:t>phase_file_scope</w:t>
-      </w:r>
-      <w:proofErr w:type="spellEnd"/>
-      <w:r>
-        <w:t xml:space="preserve"> may be overridden per repo in .harness/</w:t>
-      </w:r>
-      <w:proofErr w:type="spellStart"/>
-      <w:r>
-        <w:t>config.yaml</w:t>
-      </w:r>
-      <w:proofErr w:type="spellEnd"/>
-      <w:r>
-        <w:t>, but the override REPLACES the engine default wholesale (list every phase).</w:t>
+      <w:r>
+        <w:t xml:space="preserve">phase_skills / phase_file_scope may be overridden per repo in .harness/config.yaml, but the override REPLACES the engine default wholesale (list every phase).</w:t>
       </w:r>
     </w:p>
     <w:p>
@@ -1210,23 +733,7 @@
       </w:pPr>
       <w:r>
         <w:lastRenderedPageBreak/>
-        <w:t xml:space="preserve">Simpler skill model for backend: list only backend skills in </w:t>
-      </w:r>
-      <w:proofErr w:type="spellStart"/>
-      <w:r>
-        <w:t>phase_skills</w:t>
-      </w:r>
-      <w:proofErr w:type="spellEnd"/>
-      <w:r>
-        <w:t xml:space="preserve">; don't rely on </w:t>
-      </w:r>
-      <w:proofErr w:type="spellStart"/>
-      <w:r>
-        <w:t>skill_stacks</w:t>
-      </w:r>
-      <w:proofErr w:type="spellEnd"/>
-      <w:r>
-        <w:t xml:space="preserve"> filtering (kept in engine for future frontend repos).</w:t>
+        <w:t xml:space="preserve">Simpler skill model for backend: list only backend skills in phase_skills; don't rely on skill_stacks filtering (kept in engine for future frontend repos).</w:t>
       </w:r>
     </w:p>
     <w:p>
@@ -1237,23 +744,7 @@
         </w:numPr>
       </w:pPr>
       <w:r>
-        <w:t>BRANCH MODEL: exactly TWO branches per run (</w:t>
-      </w:r>
-      <w:proofErr w:type="spellStart"/>
-      <w:r>
-        <w:t>wip+metrics</w:t>
-      </w:r>
-      <w:proofErr w:type="spellEnd"/>
-      <w:r>
-        <w:t xml:space="preserve"> on halt, </w:t>
-      </w:r>
-      <w:proofErr w:type="spellStart"/>
-      <w:r>
-        <w:t>PR+metrics</w:t>
-      </w:r>
-      <w:proofErr w:type="spellEnd"/>
-      <w:r>
-        <w:t xml:space="preserve"> on success). The separate harness-audit/* branch was REMOVED (BCBSM: too many branches); all run artifacts now live on harness-metrics under artifacts/.</w:t>
+        <w:t xml:space="preserve">BRANCH MODEL: exactly TWO branches per run (wip+metrics on halt, PR+metrics on success). The separate harness-audit/* branch was REMOVED (BCBSM: too many branches); all run artifacts now live on harness-metrics under artifacts/.</w:t>
       </w:r>
     </w:p>
     <w:p>
@@ -1285,29 +776,8 @@
           <w:numId w:val="8"/>
         </w:numPr>
       </w:pPr>
-      <w:proofErr w:type="spellStart"/>
-      <w:r>
-        <w:t>retain_audit_branch</w:t>
-      </w:r>
-      <w:proofErr w:type="spellEnd"/>
-      <w:r>
-        <w:t xml:space="preserve"> has been REMOVED from the BCBSM service .harness/</w:t>
-      </w:r>
-      <w:proofErr w:type="spellStart"/>
-      <w:r>
-        <w:t>config.yaml</w:t>
-      </w:r>
-      <w:proofErr w:type="spellEnd"/>
-      <w:r>
-        <w:t xml:space="preserve">. The engine-side field (config.py), its run-summary recording (run.py </w:t>
-      </w:r>
-      <w:proofErr w:type="spellStart"/>
-      <w:r>
-        <w:t>cmd_collect_audit</w:t>
-      </w:r>
-      <w:proofErr w:type="spellEnd"/>
-      <w:r>
-        <w:t>) and the sample config line still exist and are inert — engine cleanup decision pending (see OPEN DECISIONS).</w:t>
+      <w:r>
+        <w:t xml:space="preserve">retain_audit_branch has been REMOVED from the BCBSM service .harness/config.yaml. The engine-side field (config.py), its run-summary recording (run.py cmd_collect_audit) and the sample config line still exist and are inert — engine cleanup decision pending (see OPEN DECISIONS).</w:t>
       </w:r>
     </w:p>
     <w:p>
@@ -1318,39 +788,7 @@
         </w:numPr>
       </w:pPr>
       <w:r>
-        <w:t xml:space="preserve">COST SOURCE = the SDK, not the billing counter (BUILT #6). Service config </w:t>
-      </w:r>
-      <w:proofErr w:type="spellStart"/>
-      <w:r>
-        <w:t>credit_source</w:t>
-      </w:r>
-      <w:proofErr w:type="spellEnd"/>
-      <w:r>
-        <w:t xml:space="preserve">: </w:t>
-      </w:r>
-      <w:proofErr w:type="spellStart"/>
-      <w:r>
-        <w:t>sdk</w:t>
-      </w:r>
-      <w:proofErr w:type="spellEnd"/>
-      <w:r>
-        <w:t xml:space="preserve"> (default) | account. Under "</w:t>
-      </w:r>
-      <w:proofErr w:type="spellStart"/>
-      <w:r>
-        <w:t>sdk</w:t>
-      </w:r>
-      <w:proofErr w:type="spellEnd"/>
-      <w:r>
-        <w:t>" the Copilot SDK reports each session's own usage and cost (</w:t>
-      </w:r>
-      <w:proofErr w:type="spellStart"/>
-      <w:r>
-        <w:t>session.usage.getMetrics</w:t>
-      </w:r>
-      <w:proofErr w:type="spellEnd"/>
-      <w:r>
-        <w:t>, one session per phase attempt); the account-level billing counter is never read. "account" keeps the old before/after delta for reconciliation on a personal seat.</w:t>
+        <w:t xml:space="preserve">COST SOURCE = the SDK, not the billing counter (BUILT #6). Service config credit_source: sdk (default) | account. Under "sdk" the Copilot SDK reports each session's own usage and cost (session.usage.getMetrics, one session per phase attempt); the account-level billing counter is never read. "account" keeps the old before/after delta for reconciliation on a personal seat.</w:t>
       </w:r>
     </w:p>
     <w:p>
@@ -1382,29 +820,8 @@
           <w:numId w:val="8"/>
         </w:numPr>
       </w:pPr>
-      <w:proofErr w:type="spellStart"/>
-      <w:r>
-        <w:t>credit_settle_seconds</w:t>
-      </w:r>
-      <w:proofErr w:type="spellEnd"/>
-      <w:r>
-        <w:t xml:space="preserve"> lives in the SERVICE </w:t>
-      </w:r>
-      <w:proofErr w:type="spellStart"/>
-      <w:r>
-        <w:t>config.yaml</w:t>
-      </w:r>
-      <w:proofErr w:type="spellEnd"/>
-      <w:r>
-        <w:t xml:space="preserve">, not an env var (one knob, developer-owned). It applies ONLY when </w:t>
-      </w:r>
-      <w:proofErr w:type="spellStart"/>
-      <w:r>
-        <w:t>credit_source</w:t>
-      </w:r>
-      <w:proofErr w:type="spellEnd"/>
-      <w:r>
-        <w:t>: account.</w:t>
+      <w:r>
+        <w:t xml:space="preserve">credit_settle_seconds lives in the SERVICE config.yaml, not an env var (one knob, developer-owned). It applies ONLY when credit_source: account.</w:t>
       </w:r>
     </w:p>
     <w:p>
@@ -1426,23 +843,7 @@
         </w:numPr>
       </w:pPr>
       <w:r>
-        <w:t>Build wrappers (</w:t>
-      </w:r>
-      <w:proofErr w:type="spellStart"/>
-      <w:r>
-        <w:t>mvnw</w:t>
-      </w:r>
-      <w:proofErr w:type="spellEnd"/>
-      <w:r>
-        <w:t>/</w:t>
-      </w:r>
-      <w:proofErr w:type="spellStart"/>
-      <w:r>
-        <w:t>gradlew</w:t>
-      </w:r>
-      <w:proofErr w:type="spellEnd"/>
-      <w:r>
-        <w:t>) are made executable ON THE RUNNER by the workflow, not by committing a mode change to each service repo (BUILT #7).</w:t>
+        <w:t>Build wrappers (mvnw/gradlew) are made executable ON THE RUNNER by the workflow, not by committing a mode change to each service repo (BUILT #7).</w:t>
       </w:r>
     </w:p>
     <w:p>
@@ -1509,6 +910,61 @@
       </w:pPr>
       <w:r>
         <w:t xml:space="preserve">Caller workflow (SDLC-Harness.yml) and .harness/config.yaml live on the default branch (master) and are inherited by each release branch when it is cut. Run with "Use workflow from: master" and base = the release branch.</w:t>
+      </w:r>
+    </w:p>
+    <w:p>
+      <w:pPr>
+        <w:numPr>
+          <w:ilvl w:val="0"/>
+          <w:numId w:val="8"/>
+        </w:numPr>
+      </w:pPr>
+      <w:r>
+        <w:t xml:space="preserve">LEARNING FROM CLARIFICATIONS = governed retrieval, not model training. Answers become reviewed files in the SERVICE repo, versioned with the code per branch; no central knowledge repo, vector index or MCP (MCP is not available at the client). Perplexity's recommendation was reviewed 2026-10-10: its diagnosis was adopted, its knowledge-repo / vector / fingerprint / JSON-contract parts deferred until metrics show cross-story repeats.</w:t>
+      </w:r>
+    </w:p>
+    <w:p>
+      <w:pPr>
+        <w:numPr>
+          <w:ilvl w:val="0"/>
+          <w:numId w:val="8"/>
+        </w:numPr>
+      </w:pPr>
+      <w:r>
+        <w:t xml:space="preserve">Developers answer clarifications in the story on the base branch, under any heading (e.g. "Response to clarification"), with or without repeating the question, then RESUME. No tagging is required; the documentation phase sorts each answer (service rule / story-only / toolkit fix). Optional override tags: [service], [story-only], [toolkit-skill], [toolkit-instruction].</w:t>
+      </w:r>
+    </w:p>
+    <w:p>
+      <w:pPr>
+        <w:numPr>
+          <w:ilvl w:val="0"/>
+          <w:numId w:val="8"/>
+        </w:numPr>
+      </w:pPr>
+      <w:r>
+        <w:t xml:space="preserve">Promotion = PR review. Service rules go to docs/decisions/&lt;feature_id&gt;.md AND as one line each to .github/copilot-instructions.md; both ride in the harness PR (docs/decisions is the only docs/ path the PR carries) and are approved with the code. Story-only answers are not recorded.</w:t>
+      </w:r>
+    </w:p>
+    <w:p>
+      <w:pPr>
+        <w:numPr>
+          <w:ilvl w:val="0"/>
+          <w:numId w:val="8"/>
+        </w:numPr>
+      </w:pPr>
+      <w:r>
+        <w:t xml:space="preserve">The harness creates .github/copilot-instructions.md when a service repo has none (first phase, toolkit build-copilot-instructions-&lt;stack&gt; skill, unknowns left as [TODO — MUST COMPLETE] for the reviewer) and only ADDS to it later (an edit that removes &gt;10% is reverted). Switch: manage_copilot_instructions (default true).</w:t>
+      </w:r>
+    </w:p>
+    <w:p>
+      <w:pPr>
+        <w:numPr>
+          <w:ilvl w:val="0"/>
+          <w:numId w:val="8"/>
+        </w:numPr>
+      </w:pPr>
+      <w:r>
+        <w:t xml:space="preserve">Toolkit changes are proposed, never applied: with toolkit_proposals: true in the caller, a proposed edit to an EXISTING toolkit skill/instruction is raised as a PR on the toolkit repo for its owner. No new token: COPILOT_GITHUB_TOKEN is reused (optional TOOLKIT_PR_TOKEN overrides). Off by default.</w:t>
       </w:r>
     </w:p>
     <w:p>
@@ -1533,21 +989,8 @@
           <w:numId w:val="9"/>
         </w:numPr>
       </w:pPr>
-      <w:proofErr w:type="spellStart"/>
-      <w:r>
-        <w:t>phase_skills</w:t>
-      </w:r>
-      <w:proofErr w:type="spellEnd"/>
-      <w:r>
-        <w:t xml:space="preserve"> maps each phase to named skills. A skill loads only if named for the phase AND (if stack-tagged) its stack is in </w:t>
-      </w:r>
-      <w:proofErr w:type="spellStart"/>
-      <w:r>
-        <w:t>repo_stacks</w:t>
-      </w:r>
-      <w:proofErr w:type="spellEnd"/>
-      <w:r>
-        <w:t>. Existing in the toolkit alone does nothing.</w:t>
+      <w:r>
+        <w:t xml:space="preserve">phase_skills maps each phase to named skills. A skill loads only if named for the phase AND (if stack-tagged) its stack is in repo_stacks. Existing in the toolkit alone does nothing.</w:t>
       </w:r>
     </w:p>
     <w:p>
@@ -1559,25 +1002,7 @@
       </w:pPr>
       <w:r>
         <w:lastRenderedPageBreak/>
-        <w:t xml:space="preserve">Backend pilot skills: build-context, </w:t>
-      </w:r>
-      <w:proofErr w:type="spellStart"/>
-      <w:r>
-        <w:t>analyze</w:t>
-      </w:r>
-      <w:proofErr w:type="spellEnd"/>
-      <w:r>
-        <w:t>-service, build-prompt-steps, build-design, security-review, build-validation. (</w:t>
-      </w:r>
-      <w:proofErr w:type="spellStart"/>
-      <w:proofErr w:type="gramStart"/>
-      <w:r>
-        <w:t>analyze</w:t>
-      </w:r>
-      <w:proofErr w:type="spellEnd"/>
-      <w:proofErr w:type="gramEnd"/>
-      <w:r>
-        <w:t>-service loads in context; review-angular-code is frontend-only.)</w:t>
+        <w:t xml:space="preserve">Backend pilot skills: build-context, analyze-service, build-prompt-steps, build-design, security-review, build-validation. (analyze-service loads in context; review-angular-code is frontend-only.)</w:t>
       </w:r>
     </w:p>
     <w:p>
@@ -1588,39 +1013,7 @@
         </w:numPr>
       </w:pPr>
       <w:r>
-        <w:t xml:space="preserve">Instructions load per phase via </w:t>
-      </w:r>
-      <w:proofErr w:type="spellStart"/>
-      <w:r>
-        <w:t>phase_file_scope</w:t>
-      </w:r>
-      <w:proofErr w:type="spellEnd"/>
-      <w:r>
-        <w:t xml:space="preserve"> (</w:t>
-      </w:r>
-      <w:proofErr w:type="spellStart"/>
-      <w:r>
-        <w:t>selective_capability</w:t>
-      </w:r>
-      <w:proofErr w:type="spellEnd"/>
-      <w:r>
-        <w:t xml:space="preserve">=true): an instruction loads when its </w:t>
-      </w:r>
-      <w:proofErr w:type="spellStart"/>
-      <w:r>
-        <w:t>applyTo</w:t>
-      </w:r>
-      <w:proofErr w:type="spellEnd"/>
-      <w:r>
-        <w:t xml:space="preserve"> glob intersects the phase scope. Root-level files (HIPAA, prompt-injection, logging, output-naming) are always-on; stack subfolders (backend/, angular-frontend/, mobile-frontend/) filtered by </w:t>
-      </w:r>
-      <w:proofErr w:type="spellStart"/>
-      <w:r>
-        <w:t>repo_stacks</w:t>
-      </w:r>
-      <w:proofErr w:type="spellEnd"/>
-      <w:r>
-        <w:t>.</w:t>
+        <w:t xml:space="preserve">Instructions load per phase via phase_file_scope (selective_capability=true): an instruction loads when its applyTo glob intersects the phase scope. Root-level files (HIPAA, prompt-injection, logging, output-naming) are always-on; stack subfolders (backend/, angular-frontend/, mobile-frontend/) filtered by repo_stacks.</w:t>
       </w:r>
     </w:p>
     <w:p>
@@ -1630,71 +1023,18 @@
           <w:numId w:val="9"/>
         </w:numPr>
       </w:pPr>
-      <w:proofErr w:type="spellStart"/>
-      <w:r>
-        <w:t>phase_file_scope</w:t>
-      </w:r>
-      <w:proofErr w:type="spellEnd"/>
-      <w:r>
-        <w:t xml:space="preserve"> is stack-NEUTRAL in the engine default (</w:t>
-      </w:r>
-      <w:proofErr w:type="spellStart"/>
-      <w:r>
-        <w:t>src</w:t>
-      </w:r>
-      <w:proofErr w:type="spellEnd"/>
-      <w:r>
-        <w:t>/</w:t>
+      <w:r>
+        <w:t xml:space="preserve">phase_file_scope is stack-NEUTRAL in the engine default (src/</w:t>
       </w:r>
       <w:r>
         <w:rPr>
           <w:b/>
           <w:bCs/>
         </w:rPr>
-        <w:t xml:space="preserve">, </w:t>
-      </w:r>
-      <w:proofErr w:type="spellStart"/>
-      <w:r>
-        <w:rPr>
-          <w:b/>
-          <w:bCs/>
-        </w:rPr>
-        <w:t>src</w:t>
-      </w:r>
-      <w:proofErr w:type="spellEnd"/>
-      <w:r>
-        <w:rPr>
-          <w:b/>
-          <w:bCs/>
-        </w:rPr>
-        <w:t>/main/</w:t>
-      </w:r>
-      <w:r>
-        <w:t xml:space="preserve">, </w:t>
-      </w:r>
-      <w:proofErr w:type="spellStart"/>
-      <w:r>
-        <w:t>src</w:t>
-      </w:r>
-      <w:proofErr w:type="spellEnd"/>
-      <w:r>
-        <w:t xml:space="preserve">/test/**); one engine serves Java, Kotlin, and (via per-repo override for </w:t>
-      </w:r>
-      <w:proofErr w:type="spellStart"/>
-      <w:r>
-        <w:t>src</w:t>
-      </w:r>
-      <w:proofErr w:type="spellEnd"/>
-      <w:r>
-        <w:t xml:space="preserve">/app) Angular. Language specificity lives in the instruction </w:t>
-      </w:r>
-      <w:proofErr w:type="spellStart"/>
-      <w:r>
-        <w:t>applyTo</w:t>
-      </w:r>
-      <w:proofErr w:type="spellEnd"/>
-      <w:r>
-        <w:t>.</w:t>
+        <w:t xml:space="preserve">, src/main/</w:t>
+      </w:r>
+      <w:r>
+        <w:t xml:space="preserve">, src/test/**); one engine serves Java, Kotlin, and (via per-repo override for src/app) Angular. Language specificity lives in the instruction applyTo.</w:t>
       </w:r>
     </w:p>
     <w:p>
@@ -1705,23 +1045,18 @@
         </w:numPr>
       </w:pPr>
       <w:r>
-        <w:t xml:space="preserve">Capability delivery is by INLINING: </w:t>
-      </w:r>
-      <w:proofErr w:type="spellStart"/>
-      <w:r>
-        <w:t>sdk_runner</w:t>
-      </w:r>
-      <w:proofErr w:type="spellEnd"/>
-      <w:r>
-        <w:t xml:space="preserve"> reads the .md files and pastes their text into the prompt, plus a capability manifest (name/path/size/sha256) as proof of what was delivered. UNVERIFIED: whether a skill's assets/ files (e.g. build-context assets/context-template.md) are </w:t>
-      </w:r>
-      <w:proofErr w:type="spellStart"/>
-      <w:r>
-        <w:t>inlined</w:t>
-      </w:r>
-      <w:proofErr w:type="spellEnd"/>
-      <w:r>
-        <w:t xml:space="preserve"> or only SKILL.md — check the capability manifest of a run.</w:t>
+        <w:t xml:space="preserve">Capability delivery is by INLINING: sdk_runner reads the .md files and pastes their text into the prompt, plus a capability manifest (name/path/size/sha256) as proof of what was delivered. UNVERIFIED: whether a skill's assets/ files (e.g. build-context assets/context-template.md) are inlined or only SKILL.md — check the capability manifest of a run.</w:t>
+      </w:r>
+    </w:p>
+    <w:p>
+      <w:pPr>
+        <w:numPr>
+          <w:ilvl w:val="0"/>
+          <w:numId w:val="9"/>
+        </w:numPr>
+      </w:pPr>
+      <w:r>
+        <w:t xml:space="preserve">The service repo's own .github/copilot-instructions.md is now inlined in EVERY phase and listed in the capability manifest (load_copilot_instructions, default true). docs/decisions/*.md are inlined in context, design, prompt_steps and validation (knowledge_paths / knowledge_phases / knowledge_max_chars 40000).</w:t>
       </w:r>
     </w:p>
     <w:p>
@@ -1747,23 +1082,7 @@
         </w:numPr>
       </w:pPr>
       <w:r>
-        <w:t xml:space="preserve">plan_check.py — NEW (plan-path gate; was missing -&gt; </w:t>
-      </w:r>
-      <w:proofErr w:type="spellStart"/>
-      <w:r>
-        <w:t>ModuleNotFoundError</w:t>
-      </w:r>
-      <w:proofErr w:type="spellEnd"/>
-      <w:r>
-        <w:t>, silently no-</w:t>
-      </w:r>
-      <w:proofErr w:type="spellStart"/>
-      <w:r>
-        <w:t>opped</w:t>
-      </w:r>
-      <w:proofErr w:type="spellEnd"/>
-      <w:r>
-        <w:t>). Auto-discovers real base package; flags wrong base package, allows new sub-packages.</w:t>
+        <w:t xml:space="preserve">plan_check.py — NEW (plan-path gate; was missing -&gt; ModuleNotFoundError, silently no-opped). Auto-discovers real base package; flags wrong base package, allows new sub-packages.</w:t>
       </w:r>
     </w:p>
     <w:p>
@@ -1774,46 +1093,14 @@
         </w:numPr>
       </w:pPr>
       <w:r>
-        <w:t>sdk_runner.py — _</w:t>
-      </w:r>
-      <w:proofErr w:type="spellStart"/>
-      <w:r>
-        <w:t>glob_intersects_scope</w:t>
-      </w:r>
-      <w:proofErr w:type="spellEnd"/>
-      <w:r>
-        <w:t xml:space="preserve"> rewritten (</w:t>
-      </w:r>
-      <w:proofErr w:type="spellStart"/>
-      <w:r>
-        <w:t>stdlib</w:t>
-      </w:r>
-      <w:proofErr w:type="spellEnd"/>
-      <w:r>
-        <w:t xml:space="preserve"> only) to handle *</w:t>
+        <w:t xml:space="preserve">sdk_runner.py — _glob_intersects_scope rewritten (stdlib only) to handle *</w:t>
       </w:r>
       <w:r>
         <w:rPr>
           <w:i/>
           <w:iCs/>
         </w:rPr>
-        <w:t xml:space="preserve">/-leading </w:t>
-      </w:r>
-      <w:proofErr w:type="spellStart"/>
-      <w:r>
-        <w:rPr>
-          <w:i/>
-          <w:iCs/>
-        </w:rPr>
-        <w:t>applyTo</w:t>
-      </w:r>
-      <w:proofErr w:type="spellEnd"/>
-      <w:r>
-        <w:rPr>
-          <w:i/>
-          <w:iCs/>
-        </w:rPr>
-        <w:t xml:space="preserve"> globs (previously dropped reactive-</w:t>
+        <w:t xml:space="preserve">/-leading applyTo globs (previously dropped reactive-</w:t>
       </w:r>
       <w:r>
         <w:t xml:space="preserve"> instructions everywhere).</w:t>
@@ -1838,23 +1125,7 @@
         </w:numPr>
       </w:pPr>
       <w:r>
-        <w:t xml:space="preserve">config.py — </w:t>
-      </w:r>
-      <w:proofErr w:type="spellStart"/>
-      <w:r>
-        <w:t>phase_file_scope</w:t>
-      </w:r>
-      <w:proofErr w:type="spellEnd"/>
-      <w:r>
-        <w:t xml:space="preserve"> made stack-neutral + given </w:t>
-      </w:r>
-      <w:proofErr w:type="spellStart"/>
-      <w:r>
-        <w:t>code_review</w:t>
-      </w:r>
-      <w:proofErr w:type="spellEnd"/>
-      <w:r>
-        <w:t xml:space="preserve"> and validation keys (empty scope had dropped naming/error-handling/reactive/OWASP from review).</w:t>
+        <w:t xml:space="preserve">config.py — phase_file_scope made stack-neutral + given code_review and validation keys (empty scope had dropped naming/error-handling/reactive/OWASP from review).</w:t>
       </w:r>
     </w:p>
     <w:p>
@@ -1865,15 +1136,7 @@
         </w:numPr>
       </w:pPr>
       <w:r>
-        <w:t>validation.py + state_machine.py — ENVIRONMENT-FAILURE halt: exit 126/127 or launcher errors (</w:t>
-      </w:r>
-      <w:proofErr w:type="spellStart"/>
-      <w:r>
-        <w:t>mvnw</w:t>
-      </w:r>
-      <w:proofErr w:type="spellEnd"/>
-      <w:r>
-        <w:t xml:space="preserve"> not executable/found, JVM launch) -&gt; CONFIG_ERROR, halt immediately, no loopback (was looping code phases and burning credits). Confirmed working at BCBSM (OP018-6418 halted cleanly on exit 126).</w:t>
+        <w:t xml:space="preserve">validation.py + state_machine.py — ENVIRONMENT-FAILURE halt: exit 126/127 or launcher errors (mvnw not executable/found, JVM launch) -&gt; CONFIG_ERROR, halt immediately, no loopback (was looping code phases and burning credits). Confirmed working at BCBSM (OP018-6418 halted cleanly on exit 126).</w:t>
       </w:r>
     </w:p>
     <w:p>
@@ -1884,68 +1147,171 @@
         </w:numPr>
       </w:pPr>
       <w:r>
-        <w:t>.</w:t>
-      </w:r>
-      <w:proofErr w:type="spellStart"/>
-      <w:r>
-        <w:t>github</w:t>
-      </w:r>
-      <w:proofErr w:type="spellEnd"/>
-      <w:r>
-        <w:t>/workflows/</w:t>
-      </w:r>
-      <w:proofErr w:type="spellStart"/>
-      <w:r>
-        <w:t>harness.yml</w:t>
-      </w:r>
-      <w:proofErr w:type="spellEnd"/>
-      <w:r>
-        <w:t xml:space="preserve"> — base input; </w:t>
-      </w:r>
-      <w:proofErr w:type="spellStart"/>
-      <w:r>
-        <w:t>wip</w:t>
-      </w:r>
-      <w:proofErr w:type="spellEnd"/>
-      <w:r>
-        <w:t xml:space="preserve">-branch force-add of resume state; PR branch cut clean from origin/&lt;base&gt;, only </w:t>
-      </w:r>
-      <w:proofErr w:type="spellStart"/>
-      <w:r>
-        <w:t>src</w:t>
-      </w:r>
-      <w:proofErr w:type="spellEnd"/>
-      <w:r>
-        <w:t>/ + docs/ restored.</w:t>
-      </w:r>
-    </w:p>
-    <w:p>
-      <w:r>
-        <w:t xml:space="preserve">Also: </w:t>
-      </w:r>
-      <w:proofErr w:type="spellStart"/>
-      <w:r>
-        <w:t>mvnw</w:t>
-      </w:r>
-      <w:proofErr w:type="spellEnd"/>
-      <w:r>
-        <w:t xml:space="preserve"> must be executable — Windows commits store it as 100644. Now handled on the runner by </w:t>
-      </w:r>
-      <w:proofErr w:type="spellStart"/>
-      <w:r>
-        <w:t>harness.yml</w:t>
-      </w:r>
-      <w:proofErr w:type="spellEnd"/>
-      <w:r>
-        <w:t xml:space="preserve"> (BUILT #7); no repo </w:t>
-      </w:r>
-      <w:proofErr w:type="gramStart"/>
-      <w:r>
-        <w:t>commit</w:t>
-      </w:r>
-      <w:proofErr w:type="gramEnd"/>
-      <w:r>
-        <w:t xml:space="preserve"> needed.</w:t>
+        <w:t xml:space="preserve">.github/workflows/harness.yml — base input; wip-branch force-add of resume state; PR branch cut clean from origin/&lt;base&gt;, only src/ + docs/ restored.</w:t>
+      </w:r>
+    </w:p>
+    <w:p>
+      <w:r>
+        <w:t xml:space="preserve">Also: mvnw must be executable — Windows commits store it as 100644. Now handled on the runner by harness.yml (BUILT #7); no repo commit needed.</w:t>
+      </w:r>
+    </w:p>
+    <w:p>
+      <w:r>
+        <w:t xml:space="preserve">===================================================================== SHIPPED — BUILT #16–#21 (branch claude/awesome-mccarthy-bboco5, 2026-10-10/11; NOT merged, NOT in v1, NOT in BCBSM)</w:t>
+      </w:r>
+    </w:p>
+    <w:p>
+      <w:pPr>
+        <w:numPr>
+          <w:ilvl w:val="0"/>
+          <w:numId w:val="2"/>
+        </w:numPr>
+      </w:pPr>
+      <w:r>
+        <w:t xml:space="preserve">#16 RESUME RE-READS THE STORY.</w:t>
+      </w:r>
+    </w:p>
+    <w:p>
+      <w:pPr>
+        <w:numPr>
+          <w:ilvl w:val="1"/>
+          <w:numId w:val="2"/>
+        </w:numPr>
+      </w:pPr>
+      <w:r>
+        <w:t xml:space="preserve">run.py init records story_path + story_sha256. resume.py --base-ref (harness.yml fetches the base): resuming at or before context replaces the story with the base branch copy (warns if unchanged); resuming later keeps the original story and warns if the base copy changed. Previously a resume after a clarification halt re-read the OLD story and asked the same questions.</w:t>
+      </w:r>
+    </w:p>
+    <w:p>
+      <w:pPr>
+        <w:numPr>
+          <w:ilvl w:val="0"/>
+          <w:numId w:val="2"/>
+        </w:numPr>
+      </w:pPr>
+      <w:r>
+        <w:t xml:space="preserve">#17 MISSING CONTEXT FILE IS NOT A QUESTION.</w:t>
+      </w:r>
+    </w:p>
+    <w:p>
+      <w:pPr>
+        <w:numPr>
+          <w:ilvl w:val="1"/>
+          <w:numId w:val="2"/>
+        </w:numPr>
+      </w:pPr>
+      <w:r>
+        <w:t xml:space="preserve">The context gate scans only a file written in this attempt; none =&gt; halt artifact_missing (status halted), not needs_input/clarification. Also stops an old context file left in the folder (e.g. committed on base) from passing the gate for the wrong story. (The credential-failure case was already fixed in commit 4af308a; the OPEN DECISIONS / KNOWN LIMITATIONS entries were stale.)</w:t>
+      </w:r>
+    </w:p>
+    <w:p>
+      <w:pPr>
+        <w:numPr>
+          <w:ilvl w:val="0"/>
+          <w:numId w:val="2"/>
+        </w:numPr>
+      </w:pPr>
+      <w:r>
+        <w:t xml:space="preserve">#18 QUESTIONS TRAVEL WITH THE RUN.</w:t>
+      </w:r>
+    </w:p>
+    <w:p>
+      <w:pPr>
+        <w:numPr>
+          <w:ilvl w:val="1"/>
+          <w:numId w:val="2"/>
+        </w:numPr>
+      </w:pPr>
+      <w:r>
+        <w:t xml:space="preserve">Each clarification halt's questions are kept in run-state.json (clarification_log). On resume they go to the context phase (treat answers as binding; ask again only if still open) and to the documentation phase (pair answers with questions by number, CL-id or order). A fresh run (resume=false) starts without them.</w:t>
+      </w:r>
+    </w:p>
+    <w:p>
+      <w:pPr>
+        <w:numPr>
+          <w:ilvl w:val="0"/>
+          <w:numId w:val="2"/>
+        </w:numPr>
+      </w:pPr>
+      <w:r>
+        <w:t xml:space="preserve">#19 SERVICE KNOWLEDGE + DECISION RECORDS.</w:t>
+      </w:r>
+    </w:p>
+    <w:p>
+      <w:pPr>
+        <w:numPr>
+          <w:ilvl w:val="1"/>
+          <w:numId w:val="2"/>
+        </w:numPr>
+      </w:pPr>
+      <w:r>
+        <w:t xml:space="preserve">sdk_runner inlines .github/copilot-instructions.md (every phase) and docs/decisions/*.md (context, design, prompt_steps, validation). The documentation phase writes docs/decisions/&lt;feature_id&gt;.md (service rules only: D-&lt;feature&gt;-&lt;n&gt;, question, answer, applies to) and adds each rule as one line under "Service rules (from answered clarifications)" in copilot-instructions.md. harness.yml PR step carries config.decisions_dir into the PR (docs/ was otherwise excluded).</w:t>
+      </w:r>
+    </w:p>
+    <w:p>
+      <w:pPr>
+        <w:numPr>
+          <w:ilvl w:val="0"/>
+          <w:numId w:val="2"/>
+        </w:numPr>
+      </w:pPr>
+      <w:r>
+        <w:t xml:space="preserve">#20 COPILOT-INSTRUCTIONS CREATED WHEN MISSING.</w:t>
+      </w:r>
+    </w:p>
+    <w:p>
+      <w:pPr>
+        <w:numPr>
+          <w:ilvl w:val="1"/>
+          <w:numId w:val="2"/>
+        </w:numPr>
+      </w:pPr>
+      <w:r>
+        <w:t xml:space="preserve">New first phase repo_instructions (phases.py), skipped when the file exists; skills build-copilot-instructions-backend / -angular-frontend / -mobile-frontend, stack-filtered; a phase_skills override that omits it falls back to the engine default. Documentation phase may write the file; the state machine reverts an edit that removes &gt;10% of it.</w:t>
+      </w:r>
+    </w:p>
+    <w:p>
+      <w:pPr>
+        <w:numPr>
+          <w:ilvl w:val="0"/>
+          <w:numId w:val="2"/>
+        </w:numPr>
+      </w:pPr>
+      <w:r>
+        <w:t xml:space="preserve">#21 TOOLKIT PROPOSAL PRs + REPORTING.</w:t>
+      </w:r>
+    </w:p>
+    <w:p>
+      <w:pPr>
+        <w:numPr>
+          <w:ilvl w:val="1"/>
+          <w:numId w:val="2"/>
+        </w:numPr>
+      </w:pPr>
+      <w:r>
+        <w:t xml:space="preserve">Caller input toolkit_proposals (default false). Documentation phase writes .harness/toolkit-proposal/ (full edited copies of existing toolkit files + PROPOSAL.md); harness.yml raises a PR on toolkit_repo (existing files under skills/ or instructions/ only; files under half the original size dropped as truncated; comments on an open proposal PR for the same file instead of opening another). Metrics schema v4: story_path, story_sha256, clarification_items, decisions_available. harness_report.py CLARIFICATIONS block: rounds per feature, unanswered re-runs, questions asked again in the same / another story.</w:t>
+      </w:r>
+    </w:p>
+    <w:p>
+      <w:pPr>
+        <w:numPr>
+          <w:ilvl w:val="0"/>
+          <w:numId w:val="2"/>
+        </w:numPr>
+      </w:pPr>
+      <w:r>
+        <w:t xml:space="preserve">TOOLKIT (copilot-toolkit, same branch): build-context treats docs/decisions/*.md as binding like the story's Clarification text; questions written as "[NEEDS CLARIFICATION]: CL-&lt;n&gt; — &lt;dimension&gt;: (a) ... (b) ..." (prefix unchanged, gate unaffected); Section 8 ends with a "How to answer" note.</w:t>
+      </w:r>
+    </w:p>
+    <w:p>
+      <w:pPr>
+        <w:numPr>
+          <w:ilvl w:val="0"/>
+          <w:numId w:val="2"/>
+        </w:numPr>
+      </w:pPr>
+      <w:r>
+        <w:t xml:space="preserve">SERVICE REPO: updated caller workflow and config.yaml in docs/examples/ (SDLC-Harness.yml: toolkit_proposals, repo_instructions in start_phase, commented TOOLKIT_PR_TOKEN; config.yaml: repo_instructions skill + scope, learning keys).</w:t>
       </w:r>
     </w:p>
     <w:p>
@@ -2118,23 +1484,7 @@
           <w:b/>
           <w:bCs/>
         </w:rPr>
-        <w:t>===================================================================== SHIPPED — BUILT #1–#8 (pushed to BCBSM/</w:t>
-      </w:r>
-      <w:proofErr w:type="spellStart"/>
-      <w:r>
-        <w:rPr>
-          <w:b/>
-          <w:bCs/>
-        </w:rPr>
-        <w:t>dx_SDLC</w:t>
-      </w:r>
-      <w:proofErr w:type="spellEnd"/>
-      <w:r>
-        <w:rPr>
-          <w:b/>
-          <w:bCs/>
-        </w:rPr>
-        <w:t>-Harness / toolkit; in v1 as of 2026-09-26)</w:t>
+        <w:t>===================================================================== SHIPPED — BUILT #1–#8 (pushed to BCBSM/dx_SDLC-Harness / toolkit; in v1 as of 2026-09-26)</w:t>
       </w:r>
     </w:p>
     <w:p>
@@ -2162,31 +1512,7 @@
         </w:numPr>
       </w:pPr>
       <w:r>
-        <w:t xml:space="preserve">Service </w:t>
-      </w:r>
-      <w:proofErr w:type="gramStart"/>
-      <w:r>
-        <w:t>config</w:t>
-      </w:r>
-      <w:proofErr w:type="gramEnd"/>
-      <w:r>
-        <w:t xml:space="preserve"> </w:t>
-      </w:r>
-      <w:proofErr w:type="spellStart"/>
-      <w:r>
-        <w:t>retain_audit_branch</w:t>
-      </w:r>
-      <w:proofErr w:type="spellEnd"/>
-      <w:r>
-        <w:t xml:space="preserve"> (default true), read by the engine; recorded into run-</w:t>
-      </w:r>
-      <w:proofErr w:type="spellStart"/>
-      <w:r>
-        <w:t>summary.json</w:t>
-      </w:r>
-      <w:proofErr w:type="spellEnd"/>
-      <w:r>
-        <w:t>.</w:t>
+        <w:t xml:space="preserve">Service config retain_audit_branch (default true), read by the engine; recorded into run-summary.json.</w:t>
       </w:r>
     </w:p>
     <w:p>
@@ -2218,45 +1544,8 @@
           <w:numId w:val="11"/>
         </w:numPr>
       </w:pPr>
-      <w:proofErr w:type="spellStart"/>
-      <w:r>
-        <w:t>harness.yml</w:t>
-      </w:r>
-      <w:proofErr w:type="spellEnd"/>
-      <w:r>
-        <w:t xml:space="preserve">: </w:t>
-      </w:r>
-      <w:proofErr w:type="spellStart"/>
-      <w:r>
-        <w:t>raise_pr</w:t>
-      </w:r>
-      <w:proofErr w:type="spellEnd"/>
-      <w:r>
-        <w:t xml:space="preserve"> step has id=</w:t>
-      </w:r>
-      <w:proofErr w:type="spellStart"/>
-      <w:r>
-        <w:t>raise_pr</w:t>
-      </w:r>
-      <w:proofErr w:type="spellEnd"/>
-      <w:r>
-        <w:t xml:space="preserve"> and emits </w:t>
-      </w:r>
-      <w:proofErr w:type="spellStart"/>
-      <w:r>
-        <w:t>pr_raised</w:t>
-      </w:r>
-      <w:proofErr w:type="spellEnd"/>
-      <w:r>
-        <w:t>=</w:t>
-      </w:r>
-      <w:proofErr w:type="spellStart"/>
-      <w:r>
-        <w:t>true|false</w:t>
-      </w:r>
-      <w:proofErr w:type="spellEnd"/>
-      <w:r>
-        <w:t>.</w:t>
+      <w:r>
+        <w:t xml:space="preserve">harness.yml: raise_pr step has id=raise_pr and emits pr_raised=true|false.</w:t>
       </w:r>
     </w:p>
     <w:p>
@@ -2267,23 +1556,7 @@
         </w:numPr>
       </w:pPr>
       <w:r>
-        <w:t>Step "Delete working branch (clean success only)": deletes harness-</w:t>
-      </w:r>
-      <w:proofErr w:type="spellStart"/>
-      <w:r>
-        <w:t>wip</w:t>
-      </w:r>
-      <w:proofErr w:type="spellEnd"/>
-      <w:r>
-        <w:t xml:space="preserve">/ &lt;feature&gt; only when success() AND </w:t>
-      </w:r>
-      <w:proofErr w:type="spellStart"/>
-      <w:r>
-        <w:t>pr_raised</w:t>
-      </w:r>
-      <w:proofErr w:type="spellEnd"/>
-      <w:r>
-        <w:t>==true AND run-summary status==done.</w:t>
+        <w:t xml:space="preserve">Step "Delete working branch (clean success only)": deletes harness-wip/ &lt;feature&gt; only when success() AND pr_raised==true AND run-summary status==done.</w:t>
       </w:r>
     </w:p>
     <w:p>
@@ -2294,15 +1567,7 @@
         </w:numPr>
       </w:pPr>
       <w:r>
-        <w:t xml:space="preserve">Halt / </w:t>
-      </w:r>
-      <w:proofErr w:type="spellStart"/>
-      <w:r>
-        <w:t>needs_input</w:t>
-      </w:r>
-      <w:proofErr w:type="spellEnd"/>
-      <w:r>
-        <w:t xml:space="preserve"> / skipped-or-failed PR -&gt; branch KEPT (resume preserved). continue-on-error: a failed cleanup never fails the job.</w:t>
+        <w:t xml:space="preserve">Halt / needs_input / skipped-or-failed PR -&gt; branch KEPT (resume preserved). continue-on-error: a failed cleanup never fails the job.</w:t>
       </w:r>
     </w:p>
     <w:p>
@@ -2324,23 +1589,7 @@
         </w:numPr>
       </w:pPr>
       <w:r>
-        <w:t xml:space="preserve">state.py: </w:t>
-      </w:r>
-      <w:proofErr w:type="spellStart"/>
-      <w:r>
-        <w:t>phase_model_log</w:t>
-      </w:r>
-      <w:proofErr w:type="spellEnd"/>
-      <w:r>
-        <w:t xml:space="preserve">, </w:t>
-      </w:r>
-      <w:proofErr w:type="spellStart"/>
-      <w:r>
-        <w:t>phase_credit_log</w:t>
-      </w:r>
-      <w:proofErr w:type="spellEnd"/>
-      <w:r>
-        <w:t xml:space="preserve"> (one entry per phase ATTEMPT).</w:t>
+        <w:t xml:space="preserve">state.py: phase_model_log, phase_credit_log (one entry per phase ATTEMPT).</w:t>
       </w:r>
     </w:p>
     <w:p>
@@ -2373,23 +1622,7 @@
         </w:numPr>
       </w:pPr>
       <w:r>
-        <w:t xml:space="preserve">CREDIT SETTLE-WAIT MOVED TO CONFIG — </w:t>
-      </w:r>
-      <w:proofErr w:type="spellStart"/>
-      <w:r>
-        <w:t>credit_settle_seconds</w:t>
-      </w:r>
-      <w:proofErr w:type="spellEnd"/>
-      <w:r>
-        <w:t xml:space="preserve"> (default 30), ONLY used under </w:t>
-      </w:r>
-      <w:proofErr w:type="spellStart"/>
-      <w:r>
-        <w:t>credit_source</w:t>
-      </w:r>
-      <w:proofErr w:type="spellEnd"/>
-      <w:r>
-        <w:t>: account. &gt;0 waits N s per phase attempt; 0 reads immediately.</w:t>
+        <w:t xml:space="preserve">CREDIT SETTLE-WAIT MOVED TO CONFIG — credit_settle_seconds (default 30), ONLY used under credit_source: account. &gt;0 waits N s per phase attempt; 0 reads immediately.</w:t>
       </w:r>
     </w:p>
     <w:p>
@@ -2400,15 +1633,7 @@
         </w:numPr>
       </w:pPr>
       <w:r>
-        <w:t xml:space="preserve">BRANCH-MODEL SIMPLIFICATION — TWO branches per run. </w:t>
-      </w:r>
-      <w:proofErr w:type="spellStart"/>
-      <w:r>
-        <w:t>harness.yml</w:t>
-      </w:r>
-      <w:proofErr w:type="spellEnd"/>
-      <w:r>
-        <w:t xml:space="preserve"> only. </w:t>
+        <w:t xml:space="preserve">BRANCH-MODEL SIMPLIFICATION — TWO branches per run. harness.yml only. </w:t>
       </w:r>
     </w:p>
     <w:p>
@@ -2430,15 +1655,7 @@
         </w:numPr>
       </w:pPr>
       <w:r>
-        <w:t>"Publish metrics + artifacts (always)": harness-metrics carries metrics/ and artifacts/&lt;feature&gt;/&lt;</w:t>
-      </w:r>
-      <w:proofErr w:type="spellStart"/>
-      <w:r>
-        <w:t>run_id</w:t>
-      </w:r>
-      <w:proofErr w:type="spellEnd"/>
-      <w:r>
-        <w:t>&gt;/.</w:t>
+        <w:t>"Publish metrics + artifacts (always)": harness-metrics carries metrics/ and artifacts/&lt;feature&gt;/&lt;run_id&gt;/.</w:t>
       </w:r>
     </w:p>
     <w:p>
@@ -2449,23 +1666,7 @@
         </w:numPr>
       </w:pPr>
       <w:r>
-        <w:t xml:space="preserve">WIP step: git add -u + </w:t>
-      </w:r>
-      <w:proofErr w:type="spellStart"/>
-      <w:r>
-        <w:t>src</w:t>
-      </w:r>
-      <w:proofErr w:type="spellEnd"/>
-      <w:r>
-        <w:t>/docs + forced run-</w:t>
-      </w:r>
-      <w:proofErr w:type="spellStart"/>
-      <w:r>
-        <w:t>state.json</w:t>
-      </w:r>
-      <w:proofErr w:type="spellEnd"/>
-      <w:r>
-        <w:t>/blocked.md.</w:t>
+        <w:t xml:space="preserve">WIP step: git add -u + src/docs + forced run-state.json/blocked.md.</w:t>
       </w:r>
     </w:p>
     <w:p>
@@ -2487,15 +1688,7 @@
         </w:numPr>
       </w:pPr>
       <w:r>
-        <w:t xml:space="preserve">SDK-REPORTED USAGE AND COST (schema v3) — replaces the billing-counter delta. Nine files: sdk_runner.py, executor.py, state.py, state_machine.py, run.py, metrics.py, config.py, </w:t>
-      </w:r>
-      <w:proofErr w:type="spellStart"/>
-      <w:r>
-        <w:t>config.yaml.sample</w:t>
-      </w:r>
-      <w:proofErr w:type="spellEnd"/>
-      <w:r>
-        <w:t xml:space="preserve">, harness_report.py. </w:t>
+        <w:t xml:space="preserve">SDK-REPORTED USAGE AND COST (schema v3) — replaces the billing-counter delta. Nine files: sdk_runner.py, executor.py, state.py, state_machine.py, run.py, metrics.py, config.py, config.yaml.sample, harness_report.py. </w:t>
       </w:r>
     </w:p>
     <w:p>
@@ -2506,39 +1699,7 @@
         </w:numPr>
       </w:pPr>
       <w:r>
-        <w:t xml:space="preserve">sdk_runner.py keeps cost and </w:t>
-      </w:r>
-      <w:proofErr w:type="spellStart"/>
-      <w:r>
-        <w:t>copilot_usage.total_nano_aiu</w:t>
-      </w:r>
-      <w:proofErr w:type="spellEnd"/>
-      <w:r>
-        <w:t xml:space="preserve"> from every </w:t>
-      </w:r>
-      <w:proofErr w:type="spellStart"/>
-      <w:r>
-        <w:t>assistant.usage</w:t>
-      </w:r>
-      <w:proofErr w:type="spellEnd"/>
-      <w:r>
-        <w:t xml:space="preserve"> event and calls </w:t>
-      </w:r>
-      <w:proofErr w:type="spellStart"/>
-      <w:r>
-        <w:t>session.rpc.usage.get_metrics</w:t>
-      </w:r>
-      <w:proofErr w:type="spellEnd"/>
-      <w:r>
-        <w:t xml:space="preserve">() before the session closes. </w:t>
-      </w:r>
-      <w:proofErr w:type="spellStart"/>
-      <w:r>
-        <w:t>getMetrics</w:t>
-      </w:r>
-      <w:proofErr w:type="spellEnd"/>
-      <w:r>
-        <w:t xml:space="preserve"> primary; event sum is fallback + cross-check. One [cost] log line per phase. Never raises.</w:t>
+        <w:t xml:space="preserve">sdk_runner.py keeps cost and copilot_usage.total_nano_aiu from every assistant.usage event and calls session.rpc.usage.get_metrics() before the session closes. getMetrics primary; event sum is fallback + cross-check. One [cost] log line per phase. Never raises.</w:t>
       </w:r>
     </w:p>
     <w:p>
@@ -2549,15 +1710,7 @@
         </w:numPr>
       </w:pPr>
       <w:r>
-        <w:t xml:space="preserve">executor.py: </w:t>
-      </w:r>
-      <w:proofErr w:type="spellStart"/>
-      <w:r>
-        <w:t>AgentResult.usage_metrics</w:t>
-      </w:r>
-      <w:proofErr w:type="spellEnd"/>
-      <w:r>
-        <w:t>, separate from tokens.</w:t>
+        <w:t xml:space="preserve">executor.py: AgentResult.usage_metrics, separate from tokens.</w:t>
       </w:r>
     </w:p>
     <w:p>
@@ -2569,47 +1722,7 @@
       </w:pPr>
       <w:r>
         <w:lastRenderedPageBreak/>
-        <w:t xml:space="preserve">state.py: </w:t>
-      </w:r>
-      <w:proofErr w:type="spellStart"/>
-      <w:r>
-        <w:t>total_premium_cost</w:t>
-      </w:r>
-      <w:proofErr w:type="spellEnd"/>
-      <w:r>
-        <w:t xml:space="preserve">, </w:t>
-      </w:r>
-      <w:proofErr w:type="spellStart"/>
-      <w:r>
-        <w:t>total_nano_aiu</w:t>
-      </w:r>
-      <w:proofErr w:type="spellEnd"/>
-      <w:r>
-        <w:t xml:space="preserve">, </w:t>
-      </w:r>
-      <w:proofErr w:type="spellStart"/>
-      <w:r>
-        <w:t>model_usage</w:t>
-      </w:r>
-      <w:proofErr w:type="spellEnd"/>
-      <w:r>
-        <w:t xml:space="preserve">, </w:t>
-      </w:r>
-      <w:proofErr w:type="spellStart"/>
-      <w:r>
-        <w:t>cost_source</w:t>
-      </w:r>
-      <w:proofErr w:type="spellEnd"/>
-      <w:r>
-        <w:t>. Old run-</w:t>
-      </w:r>
-      <w:proofErr w:type="spellStart"/>
-      <w:r>
-        <w:t>state.json</w:t>
-      </w:r>
-      <w:proofErr w:type="spellEnd"/>
-      <w:r>
-        <w:t xml:space="preserve"> files still load.</w:t>
+        <w:t xml:space="preserve">state.py: total_premium_cost, total_nano_aiu, model_usage, cost_source. Old run-state.json files still load.</w:t>
       </w:r>
     </w:p>
     <w:p>
@@ -2620,15 +1733,7 @@
         </w:numPr>
       </w:pPr>
       <w:r>
-        <w:t xml:space="preserve">state_machine.py / run.py: billing-counter reads + settle wait run ONLY under </w:t>
-      </w:r>
-      <w:proofErr w:type="spellStart"/>
-      <w:r>
-        <w:t>credit_source</w:t>
-      </w:r>
-      <w:proofErr w:type="spellEnd"/>
-      <w:r>
-        <w:t>: account. New per-phase SDK cost table in the report.</w:t>
+        <w:t xml:space="preserve">state_machine.py / run.py: billing-counter reads + settle wait run ONLY under credit_source: account. New per-phase SDK cost table in the report.</w:t>
       </w:r>
     </w:p>
     <w:p>
@@ -2639,47 +1744,7 @@
         </w:numPr>
       </w:pPr>
       <w:r>
-        <w:t xml:space="preserve">metrics.py: SCHEMA_VERSION 3 — </w:t>
-      </w:r>
-      <w:proofErr w:type="spellStart"/>
-      <w:r>
-        <w:t>premium_cost</w:t>
-      </w:r>
-      <w:proofErr w:type="spellEnd"/>
-      <w:r>
-        <w:t xml:space="preserve">_&lt;phase&gt;, </w:t>
-      </w:r>
-      <w:proofErr w:type="spellStart"/>
-      <w:r>
-        <w:t>nano_aiu</w:t>
-      </w:r>
-      <w:proofErr w:type="spellEnd"/>
-      <w:r>
-        <w:t xml:space="preserve">_&lt;phase&gt;, totals, per-model usage_*, </w:t>
-      </w:r>
-      <w:proofErr w:type="spellStart"/>
-      <w:r>
-        <w:t>models_used</w:t>
-      </w:r>
-      <w:proofErr w:type="spellEnd"/>
-      <w:r>
-        <w:t xml:space="preserve">, </w:t>
-      </w:r>
-      <w:proofErr w:type="spellStart"/>
-      <w:r>
-        <w:t>credit_source</w:t>
-      </w:r>
-      <w:proofErr w:type="spellEnd"/>
-      <w:r>
-        <w:t xml:space="preserve">, </w:t>
-      </w:r>
-      <w:proofErr w:type="spellStart"/>
-      <w:r>
-        <w:t>cost_reported_by</w:t>
-      </w:r>
-      <w:proofErr w:type="spellEnd"/>
-      <w:r>
-        <w:t>.</w:t>
+        <w:t xml:space="preserve">metrics.py: SCHEMA_VERSION 3 — premium_cost_&lt;phase&gt;, nano_aiu_&lt;phase&gt;, totals, per-model usage_*, models_used, credit_source, cost_reported_by.</w:t>
       </w:r>
     </w:p>
     <w:p>
@@ -2690,15 +1755,7 @@
         </w:numPr>
       </w:pPr>
       <w:r>
-        <w:t>ai_credits.py unchanged; out of the run path under "</w:t>
-      </w:r>
-      <w:proofErr w:type="spellStart"/>
-      <w:r>
-        <w:t>sdk</w:t>
-      </w:r>
-      <w:proofErr w:type="spellEnd"/>
-      <w:r>
-        <w:t>".</w:t>
+        <w:t>ai_credits.py unchanged; out of the run path under "sdk".</w:t>
       </w:r>
     </w:p>
     <w:p>
@@ -2709,15 +1766,7 @@
         </w:numPr>
       </w:pPr>
       <w:r>
-        <w:t xml:space="preserve">VERIFIED in CI (2026-09-26): [cost] ... (source: </w:t>
-      </w:r>
-      <w:proofErr w:type="spellStart"/>
-      <w:r>
-        <w:t>session_metrics</w:t>
-      </w:r>
-      <w:proofErr w:type="spellEnd"/>
-      <w:r>
-        <w:t>) appears. STILL OPEN: reconcile one run's nano-AIU against the org billing report.</w:t>
+        <w:t xml:space="preserve">VERIFIED in CI (2026-09-26): [cost] ... (source: session_metrics) appears. STILL OPEN: reconcile one run's nano-AIU against the org billing report.</w:t>
       </w:r>
     </w:p>
     <w:p>
@@ -2728,23 +1777,7 @@
         </w:numPr>
       </w:pPr>
       <w:r>
-        <w:t>CAVEAT: both SDK usage APIs are EXPERIMENTAL in the pinned SDK (</w:t>
-      </w:r>
-      <w:proofErr w:type="spellStart"/>
-      <w:r>
-        <w:t>github</w:t>
-      </w:r>
-      <w:proofErr w:type="spellEnd"/>
-      <w:r>
-        <w:t>-copilot-</w:t>
-      </w:r>
-      <w:proofErr w:type="spellStart"/>
-      <w:r>
-        <w:t>sdk</w:t>
-      </w:r>
-      <w:proofErr w:type="spellEnd"/>
-      <w:r>
-        <w:t>==1.0.4). Re-check whenever the pin moves.</w:t>
+        <w:t>CAVEAT: both SDK usage APIs are EXPERIMENTAL in the pinned SDK (github-copilot-sdk==1.0.4). Re-check whenever the pin moves.</w:t>
       </w:r>
     </w:p>
     <w:p>
@@ -2766,23 +1799,7 @@
         </w:numPr>
       </w:pPr>
       <w:r>
-        <w:t>WORKFLOW FIXES (</w:t>
-      </w:r>
-      <w:proofErr w:type="spellStart"/>
-      <w:r>
-        <w:t>harness.yml</w:t>
-      </w:r>
-      <w:proofErr w:type="spellEnd"/>
-      <w:r>
-        <w:t xml:space="preserve">, 2026-09-25/26) — restore BCBSM wiring lost when v1 moved, plus the </w:t>
-      </w:r>
-      <w:proofErr w:type="spellStart"/>
-      <w:r>
-        <w:t>mvnw</w:t>
-      </w:r>
-      <w:proofErr w:type="spellEnd"/>
-      <w:r>
-        <w:t xml:space="preserve"> fix. Workflow only; no engine change. </w:t>
+        <w:t xml:space="preserve">WORKFLOW FIXES (harness.yml, 2026-09-25/26) — restore BCBSM wiring lost when v1 moved, plus the mvnw fix. Workflow only; no engine change. </w:t>
       </w:r>
     </w:p>
     <w:p>
@@ -2793,15 +1810,7 @@
         </w:numPr>
       </w:pPr>
       <w:r>
-        <w:t xml:space="preserve">Engine checkout passes token: ${{ </w:t>
-      </w:r>
-      <w:proofErr w:type="spellStart"/>
-      <w:r>
-        <w:t>secrets.COPILOT_GITHUB_TOKEN</w:t>
-      </w:r>
-      <w:proofErr w:type="spellEnd"/>
-      <w:r>
-        <w:t xml:space="preserve"> }}. The engine repo is PRIVATE at BCBSM; the default Actions token cannot read another private repo, so checkout failed with "could not read Username for '</w:t>
+        <w:t xml:space="preserve">Engine checkout passes token: ${{ secrets.COPILOT_GITHUB_TOKEN }}. The engine repo is PRIVATE at BCBSM; the default Actions token cannot read another private repo, so checkout failed with "could not read Username for '</w:t>
       </w:r>
       <w:hyperlink r:id="rId5" w:history="1">
         <w:r>
@@ -2834,39 +1843,7 @@
         </w:numPr>
       </w:pPr>
       <w:r>
-        <w:t xml:space="preserve">COPILOT_MODEL_TOKEN declared as an OPTIONAL </w:t>
-      </w:r>
-      <w:proofErr w:type="spellStart"/>
-      <w:r>
-        <w:t>workflow_call</w:t>
-      </w:r>
-      <w:proofErr w:type="spellEnd"/>
-      <w:r>
-        <w:t xml:space="preserve"> secret and set on the </w:t>
-      </w:r>
-      <w:proofErr w:type="spellStart"/>
-      <w:r>
-        <w:t>init</w:t>
-      </w:r>
-      <w:proofErr w:type="spellEnd"/>
-      <w:r>
-        <w:t xml:space="preserve"> / Autorun / Collect audit steps as COPILOT_MODEL_TOKEN: ${{ </w:t>
-      </w:r>
-      <w:proofErr w:type="spellStart"/>
-      <w:r>
-        <w:t>secrets.COPILOT_MODEL_TOKEN</w:t>
-      </w:r>
-      <w:proofErr w:type="spellEnd"/>
-      <w:r>
-        <w:t xml:space="preserve"> || </w:t>
-      </w:r>
-      <w:proofErr w:type="spellStart"/>
-      <w:r>
-        <w:t>github.token</w:t>
-      </w:r>
-      <w:proofErr w:type="spellEnd"/>
-      <w:r>
-        <w:t xml:space="preserve"> }} REQUIRED — see AUTH, "model-token precedence".</w:t>
+        <w:t xml:space="preserve">COPILOT_MODEL_TOKEN declared as an OPTIONAL workflow_call secret and set on the init / Autorun / Collect audit steps as COPILOT_MODEL_TOKEN: ${{ secrets.COPILOT_MODEL_TOKEN || github.token }} REQUIRED — see AUTH, "model-token precedence".</w:t>
       </w:r>
     </w:p>
     <w:p>
@@ -2877,39 +1854,7 @@
         </w:numPr>
       </w:pPr>
       <w:r>
-        <w:t xml:space="preserve">New step "Make build wrappers executable": </w:t>
-      </w:r>
-      <w:proofErr w:type="spellStart"/>
-      <w:r>
-        <w:t>chmod</w:t>
-      </w:r>
-      <w:proofErr w:type="spellEnd"/>
-      <w:r>
-        <w:t xml:space="preserve"> +x </w:t>
-      </w:r>
-      <w:proofErr w:type="spellStart"/>
-      <w:r>
-        <w:t>mvnw</w:t>
-      </w:r>
-      <w:proofErr w:type="spellEnd"/>
-      <w:r>
-        <w:t xml:space="preserve"> / </w:t>
-      </w:r>
-      <w:proofErr w:type="spellStart"/>
-      <w:r>
-        <w:t>gradlew</w:t>
-      </w:r>
-      <w:proofErr w:type="spellEnd"/>
-      <w:r>
-        <w:t xml:space="preserve"> on the runner copy only, with git config </w:t>
-      </w:r>
-      <w:proofErr w:type="spellStart"/>
-      <w:r>
-        <w:t>core.fileMode</w:t>
-      </w:r>
-      <w:proofErr w:type="spellEnd"/>
-      <w:r>
-        <w:t xml:space="preserve"> false so the mode flip never reaches the WIP or PR branch.</w:t>
+        <w:t xml:space="preserve">New step "Make build wrappers executable": chmod +x mvnw / gradlew on the runner copy only, with git config core.fileMode false so the mode flip never reaches the WIP or PR branch.</w:t>
       </w:r>
     </w:p>
     <w:p>
@@ -2920,15 +1865,7 @@
         </w:numPr>
       </w:pPr>
       <w:r>
-        <w:t xml:space="preserve">Collect audit guarded with </w:t>
-      </w:r>
-      <w:proofErr w:type="spellStart"/>
-      <w:r>
-        <w:t>hashFiles</w:t>
-      </w:r>
-      <w:proofErr w:type="spellEnd"/>
-      <w:r>
-        <w:t>('engine/harness/run.py') so a failed engine checkout no longer produces a second, misleading error.</w:t>
+        <w:t xml:space="preserve">Collect audit guarded with hashFiles('engine/harness/run.py') so a failed engine checkout no longer produces a second, misleading error.</w:t>
       </w:r>
     </w:p>
     <w:p>
@@ -2939,15 +1876,7 @@
         </w:numPr>
       </w:pPr>
       <w:r>
-        <w:t xml:space="preserve">Status: YAML validated; checkout-token fix verified in CI; model-token and </w:t>
-      </w:r>
-      <w:proofErr w:type="spellStart"/>
-      <w:r>
-        <w:t>chmod</w:t>
-      </w:r>
-      <w:proofErr w:type="spellEnd"/>
-      <w:r>
-        <w:t xml:space="preserve"> steps NOT yet run end to end.</w:t>
+        <w:t xml:space="preserve">Status: YAML validated; checkout-token fix verified in CI; model-token and chmod steps NOT yet run end to end.</w:t>
       </w:r>
     </w:p>
     <w:p>
@@ -2970,8 +1899,6 @@
       </w:pPr>
       <w:r>
         <w:t xml:space="preserve">"Non-blocking-question scan": every [NEEDS CLARIFICATION] must pass three tests or be removed — (1) mechanics: asks HOW (annotation, setting, class, library) -&gt; delegate to later phases; (2) derivability: the story's ACs / Clarification </w:t>
-      </w:r>
-      <w:r>
         <w:lastRenderedPageBreak/>
         <w:t>text / out-of-scope leave one compliant option -&gt; encode as a traced AC or SHALL NOT; (3) outcome-equivalence: all options behave the same -&gt; drop.</w:t>
       </w:r>
@@ -2984,15 +1911,7 @@
         </w:numPr>
       </w:pPr>
       <w:r>
-        <w:t xml:space="preserve">CI rules: the story's Clarification text is binding; surface ALL blocking questions in ONE pass incl. adjacent cases (null/absent, empty, </w:t>
-      </w:r>
-      <w:proofErr w:type="spellStart"/>
-      <w:r>
-        <w:t>enum</w:t>
-      </w:r>
-      <w:proofErr w:type="spellEnd"/>
-      <w:r>
-        <w:t xml:space="preserve"> vs free-form, unrecognised value, scope boundary).</w:t>
+        <w:t xml:space="preserve">CI rules: the story's Clarification text is binding; surface ALL blocking questions in ONE pass incl. adjacent cases (null/absent, empty, enum vs free-form, unrecognised value, scope boundary).</w:t>
       </w:r>
     </w:p>
     <w:p>
@@ -3025,15 +1944,7 @@
         </w:numPr>
       </w:pPr>
       <w:r>
-        <w:t xml:space="preserve">VERIFIED: OP018-6418 context passed on the next run with no added clarification (the </w:t>
-      </w:r>
-      <w:proofErr w:type="spellStart"/>
-      <w:r>
-        <w:t>MapStruct</w:t>
-      </w:r>
-      <w:proofErr w:type="spellEnd"/>
-      <w:r>
-        <w:t xml:space="preserve"> mapping question was not re-raised).</w:t>
+        <w:t xml:space="preserve">VERIFIED: OP018-6418 context passed on the next run with no added clarification (the MapStruct mapping question was not re-raised).</w:t>
       </w:r>
     </w:p>
     <w:p>
@@ -3048,118 +1959,22 @@
           <w:b/>
           <w:bCs/>
         </w:rPr>
-        <w:t>===================================================================== SERVICE REPO .</w:t>
-      </w:r>
-      <w:proofErr w:type="spellStart"/>
-      <w:r>
-        <w:rPr>
-          <w:b/>
-          <w:bCs/>
-        </w:rPr>
-        <w:t>gitignore</w:t>
-      </w:r>
-      <w:proofErr w:type="spellEnd"/>
-      <w:r>
-        <w:rPr>
-          <w:b/>
-          <w:bCs/>
-        </w:rPr>
-        <w:t xml:space="preserve"> (REQUIRED so harness files never merge)</w:t>
-      </w:r>
-    </w:p>
-    <w:p>
-      <w:r>
-        <w:t>Add to the service repo's .</w:t>
-      </w:r>
-      <w:proofErr w:type="spellStart"/>
-      <w:r>
-        <w:t>gitignore</w:t>
-      </w:r>
-      <w:proofErr w:type="spellEnd"/>
-      <w:r>
-        <w:t>. These paths must never reach a dev/release branch. The harness force-adds .harness/run-</w:t>
-      </w:r>
-      <w:proofErr w:type="spellStart"/>
-      <w:r>
-        <w:t>state.json</w:t>
-      </w:r>
-      <w:proofErr w:type="spellEnd"/>
-      <w:r>
-        <w:t xml:space="preserve"> + blocked.md onto harness-</w:t>
-      </w:r>
-      <w:proofErr w:type="spellStart"/>
-      <w:r>
-        <w:t>wip</w:t>
-      </w:r>
-      <w:proofErr w:type="spellEnd"/>
-      <w:r>
-        <w:t xml:space="preserve"> only; all artifacts live on harness-metrics (metrics/ + artifacts/). .harness/* !.harness/</w:t>
-      </w:r>
-      <w:proofErr w:type="spellStart"/>
-      <w:r>
-        <w:t>config.yaml</w:t>
-      </w:r>
-      <w:proofErr w:type="spellEnd"/>
-      <w:r>
-        <w:t xml:space="preserve"> audit/ metrics/</w:t>
-      </w:r>
-    </w:p>
-    <w:p>
-      <w:r>
-        <w:t>IMPORTANT — the pattern is .harness/* , NOT .harness/ . Git cannot re-include a file once a parent DIRECTORY is excluded, so .harness/ makes the !.harness/</w:t>
-      </w:r>
-      <w:proofErr w:type="spellStart"/>
-      <w:r>
-        <w:t>config.yaml</w:t>
-      </w:r>
-      <w:proofErr w:type="spellEnd"/>
-      <w:r>
-        <w:t xml:space="preserve"> line a no-op and the service repo's own config can never be committed to the base branch. .harness/* excludes the CONTENTS, which leaves the exception working. Verified: with .harness/ git check-ignore still reports </w:t>
-      </w:r>
-      <w:proofErr w:type="spellStart"/>
-      <w:r>
-        <w:t>config.yaml</w:t>
-      </w:r>
-      <w:proofErr w:type="spellEnd"/>
-      <w:r>
-        <w:t xml:space="preserve"> as ignored; with .harness/* it is staged while run-</w:t>
-      </w:r>
-      <w:proofErr w:type="spellStart"/>
-      <w:r>
-        <w:t>state.json</w:t>
-      </w:r>
-      <w:proofErr w:type="spellEnd"/>
-      <w:r>
-        <w:t xml:space="preserve"> stays ignored.</w:t>
-      </w:r>
-    </w:p>
-    <w:p>
-      <w:r>
-        <w:t>.harness/</w:t>
-      </w:r>
-      <w:proofErr w:type="spellStart"/>
-      <w:r>
-        <w:t>config.yaml</w:t>
-      </w:r>
-      <w:proofErr w:type="spellEnd"/>
-      <w:r>
-        <w:t xml:space="preserve"> MUST be committed on the base branch — the engine reads it from the checked-out branch at the start of every run. Everything else under .harness/ is run workspace and must stay out. (.</w:t>
-      </w:r>
-      <w:proofErr w:type="spellStart"/>
-      <w:r>
-        <w:t>gitignore</w:t>
-      </w:r>
-      <w:proofErr w:type="spellEnd"/>
-      <w:r>
-        <w:t xml:space="preserve"> only affects UNTRACKED files, so a </w:t>
-      </w:r>
-      <w:proofErr w:type="spellStart"/>
-      <w:r>
-        <w:t>config.yaml</w:t>
-      </w:r>
-      <w:proofErr w:type="spellEnd"/>
-      <w:r>
-        <w:t xml:space="preserve"> that is already committed is unaffected either way.)</w:t>
+        <w:t xml:space="preserve">===================================================================== SERVICE REPO .gitignore (REQUIRED so harness files never merge)</w:t>
+      </w:r>
+    </w:p>
+    <w:p>
+      <w:r>
+        <w:t xml:space="preserve">Add to the service repo's .gitignore. These paths must never reach a dev/release branch. The harness force-adds .harness/run-state.json + blocked.md onto harness-wip only; all artifacts live on harness-metrics (metrics/ + artifacts/). .harness/* !.harness/config.yaml audit/ metrics/</w:t>
+      </w:r>
+    </w:p>
+    <w:p>
+      <w:r>
+        <w:t xml:space="preserve">IMPORTANT — the pattern is .harness/* , NOT .harness/ . Git cannot re-include a file once a parent DIRECTORY is excluded, so .harness/ makes the !.harness/config.yaml line a no-op and the service repo's own config can never be committed to the base branch. .harness/* excludes the CONTENTS, which leaves the exception working. Verified: with .harness/ git check-ignore still reports config.yaml as ignored; with .harness/* it is staged while run-state.json stays ignored.</w:t>
+      </w:r>
+    </w:p>
+    <w:p>
+      <w:r>
+        <w:t xml:space="preserve">.harness/config.yaml MUST be committed on the base branch — the engine reads it from the checked-out branch at the start of every run. Everything else under .harness/ is run workspace and must stay out. (.gitignore only affects UNTRACKED files, so a config.yaml that is already committed is unaffected either way.)</w:t>
       </w:r>
     </w:p>
     <w:p>
@@ -3195,29 +2010,8 @@
           <w:numId w:val="12"/>
         </w:numPr>
       </w:pPr>
-      <w:proofErr w:type="spellStart"/>
-      <w:r>
-        <w:t>retain_audit_branch</w:t>
-      </w:r>
-      <w:proofErr w:type="spellEnd"/>
-      <w:r>
-        <w:t xml:space="preserve">: removed from the service config. Decide whether to also remove the engine field (config.py), run.py </w:t>
-      </w:r>
-      <w:proofErr w:type="spellStart"/>
-      <w:r>
-        <w:t>cmd_collect_audit</w:t>
-      </w:r>
-      <w:proofErr w:type="spellEnd"/>
-      <w:r>
-        <w:t xml:space="preserve"> recording, and the sample </w:t>
-      </w:r>
-      <w:proofErr w:type="spellStart"/>
-      <w:r>
-        <w:t>config.yaml</w:t>
-      </w:r>
-      <w:proofErr w:type="spellEnd"/>
-      <w:r>
-        <w:t xml:space="preserve"> line, or leave them as a harmless no-op.</w:t>
+      <w:r>
+        <w:t xml:space="preserve">retain_audit_branch: removed from the service config. Decide whether to also remove the engine field (config.py), run.py cmd_collect_audit recording, and the sample config.yaml line, or leave them as a harmless no-op.</w:t>
       </w:r>
     </w:p>
     <w:p>
@@ -3239,23 +2033,7 @@
         </w:numPr>
       </w:pPr>
       <w:r>
-        <w:t>Per-DEVELOPER cost attribution is NOT available under the Actions-token route: usage bills to the organization, and GitHub does not expose per-user premium-request usage to org admins in enterprise-owned orgs. Per-STORY cost is available; who triggered each run is recorded (</w:t>
-      </w:r>
-      <w:proofErr w:type="spellStart"/>
-      <w:r>
-        <w:t>github.actor</w:t>
-      </w:r>
-      <w:proofErr w:type="spellEnd"/>
-      <w:r>
-        <w:t xml:space="preserve">). If BCBSM insists on per-developer spend, </w:t>
-      </w:r>
-      <w:proofErr w:type="gramStart"/>
-      <w:r>
-        <w:t>it</w:t>
-      </w:r>
-      <w:proofErr w:type="gramEnd"/>
-      <w:r>
-        <w:t xml:space="preserve"> needs per-developer credentials (does not scale) or enterprise-level billing reporting.</w:t>
+        <w:t xml:space="preserve">Per-DEVELOPER cost attribution is NOT available under the Actions-token route: usage bills to the organization, and GitHub does not expose per-user premium-request usage to org admins in enterprise-owned orgs. Per-STORY cost is available; who triggered each run is recorded (github.actor). If BCBSM insists on per-developer spend, it needs per-developer credentials (does not scale) or enterprise-level billing reporting.</w:t>
       </w:r>
     </w:p>
     <w:p>
@@ -3266,16 +2044,7 @@
         </w:numPr>
       </w:pPr>
       <w:r>
-        <w:lastRenderedPageBreak/>
-        <w:t xml:space="preserve">Engine: report model-call auth / SDK errors in the context phase as a CONFIG_ERROR halt, not </w:t>
-      </w:r>
-      <w:proofErr w:type="spellStart"/>
-      <w:r>
-        <w:t>needs_input</w:t>
-      </w:r>
-      <w:proofErr w:type="spellEnd"/>
-      <w:r>
-        <w:t xml:space="preserve"> (see KNOWN LIMITATIONS).</w:t>
+        <w:t xml:space="preserve">RESOLVED: model-call auth / SDK errors in context already halt as SDK_ERROR (commit 4af308a); a missing context file now halts as artifact_missing (BUILT #17).</w:t>
       </w:r>
     </w:p>
     <w:p>
@@ -3330,7 +2099,7 @@
         </w:numPr>
       </w:pPr>
       <w:r>
-        <w:t xml:space="preserve">Resume should read .harness/config.yaml from the base branch instead of the WIP branch (proposed, not built).</w:t>
+        <w:t xml:space="preserve">Resume should read .harness/config.yaml from the base branch instead of the WIP branch (proposed, not built). The STORY is now re-read from the base branch on resume (BUILT #16); config.yaml still comes from the WIP branch.</w:t>
       </w:r>
     </w:p>
     <w:p>
@@ -3353,6 +2122,28 @@
       </w:pPr>
       <w:r>
         <w:t xml:space="preserve">Services using the Spring Java Format plugin: set pre_validation_command "mvn -s $MAVEN_SETTINGS spring-javaformat:apply" to avoid a formatting-only loopback. Check whether BCBSM services use the plugin.</w:t>
+      </w:r>
+    </w:p>
+    <w:p>
+      <w:pPr>
+        <w:numPr>
+          <w:ilvl w:val="0"/>
+          <w:numId w:val="12"/>
+        </w:numPr>
+      </w:pPr>
+      <w:r>
+        <w:t xml:space="preserve">Merge claude/awesome-mccarthy-bboco5 (SDLC-Harness + copilot-toolkit) to main and re-tag v1 — the caller passes toolkit_proposals, which an older v1 rejects as an unknown input. Then sync engine #9–#21 and the build-context change to BCBSM, and confirm the three build-copilot-instructions-* skills exist with the same folder names in dx_copilot-standards-workspace.</w:t>
+      </w:r>
+    </w:p>
+    <w:p>
+      <w:pPr>
+        <w:numPr>
+          <w:ilvl w:val="0"/>
+          <w:numId w:val="12"/>
+        </w:numPr>
+      </w:pPr>
+      <w:r>
+        <w:t xml:space="preserve">Whether to enable toolkit_proposals at BCBSM (needs master protected by PR review on the standards repo; PRs will show the PAT owner as author).</w:t>
       </w:r>
     </w:p>
     <w:p>
@@ -3378,15 +2169,7 @@
         </w:numPr>
       </w:pPr>
       <w:r>
-        <w:t xml:space="preserve">A story needing a </w:t>
-      </w:r>
-      <w:proofErr w:type="gramStart"/>
-      <w:r>
-        <w:t>new dependency halts</w:t>
-      </w:r>
-      <w:proofErr w:type="gramEnd"/>
-      <w:r>
-        <w:t xml:space="preserve"> by design — no phase may write pom.xml. Add the dependency by hand and resume.</w:t>
+        <w:t xml:space="preserve">A story needing a new dependency halts by design — no phase may write pom.xml. Add the dependency by hand and resume.</w:t>
       </w:r>
     </w:p>
     <w:p>
@@ -3397,23 +2180,7 @@
         </w:numPr>
       </w:pPr>
       <w:r>
-        <w:t xml:space="preserve">Only </w:t>
-      </w:r>
-      <w:proofErr w:type="gramStart"/>
-      <w:r>
-        <w:t>new-development</w:t>
-      </w:r>
-      <w:proofErr w:type="gramEnd"/>
-      <w:r>
-        <w:t xml:space="preserve"> / enhancement profiles exist. </w:t>
-      </w:r>
-      <w:proofErr w:type="gramStart"/>
-      <w:r>
-        <w:t>Bug-fix</w:t>
-      </w:r>
-      <w:proofErr w:type="gramEnd"/>
-      <w:r>
-        <w:t xml:space="preserve"> / analysis profile (diagnose root cause, derive ACs, test-before-fix) is designed, not built.</w:t>
+        <w:t xml:space="preserve">Only new-development / enhancement profiles exist. Bug-fix / analysis profile (diagnose root cause, derive ACs, test-before-fix) is designed, not built.</w:t>
       </w:r>
     </w:p>
     <w:p>
@@ -3435,39 +2202,7 @@
         </w:numPr>
       </w:pPr>
       <w:r>
-        <w:t xml:space="preserve">COST REPORTING (BUILT #6): under the default </w:t>
-      </w:r>
-      <w:proofErr w:type="spellStart"/>
-      <w:r>
-        <w:t>credit_source</w:t>
-      </w:r>
-      <w:proofErr w:type="spellEnd"/>
-      <w:r>
-        <w:t xml:space="preserve">: </w:t>
-      </w:r>
-      <w:proofErr w:type="spellStart"/>
-      <w:r>
-        <w:t>sdk</w:t>
-      </w:r>
-      <w:proofErr w:type="spellEnd"/>
-      <w:r>
-        <w:t xml:space="preserve"> the harness reports per-phase and per-run usage from the Copilot SDK, which works on org-billed seats and is unaffected by concurrent runs. Figures are in SDK units with no documented conversion to AI credits or dollars — comparable run-to-</w:t>
-      </w:r>
-      <w:proofErr w:type="gramStart"/>
-      <w:r>
-        <w:t>run, but</w:t>
-      </w:r>
-      <w:proofErr w:type="gramEnd"/>
-      <w:r>
-        <w:t xml:space="preserve"> reconcile against the org billing report before quoting as money. SDK usage APIs are experimental in the pinned SDK version. Under </w:t>
-      </w:r>
-      <w:proofErr w:type="spellStart"/>
-      <w:r>
-        <w:t>credit_source</w:t>
-      </w:r>
-      <w:proofErr w:type="spellEnd"/>
-      <w:r>
-        <w:t>: account the old limits still apply (needs Plan: Read, blank on org-billed seats).</w:t>
+        <w:t xml:space="preserve">COST REPORTING (BUILT #6): under the default credit_source: sdk the harness reports per-phase and per-run usage from the Copilot SDK, which works on org-billed seats and is unaffected by concurrent runs. Figures are in SDK units with no documented conversion to AI credits or dollars — comparable run-to-run, but reconcile against the org billing report before quoting as money. SDK usage APIs are experimental in the pinned SDK version. Under credit_source: account the old limits still apply (needs Plan: Read, blank on org-billed seats).</w:t>
       </w:r>
     </w:p>
     <w:p>
@@ -3489,23 +2224,7 @@
         </w:numPr>
       </w:pPr>
       <w:r>
-        <w:t xml:space="preserve">CONTEXT CLARIFICATION CHURN: the context gate stops at the first blocking set of ambiguities, so answering one layer can expose the next (OP018-6418 halted three times). Mitigated by BUILT #8 (one-pass rule; derivable and mechanics questions removed). Further mitigation: write developer answers into the story as testable ACs rather than </w:t>
-      </w:r>
-      <w:proofErr w:type="gramStart"/>
-      <w:r>
-        <w:t>prose, and</w:t>
-      </w:r>
-      <w:proofErr w:type="gramEnd"/>
-      <w:r>
-        <w:t xml:space="preserve"> have the upstream harness-change-</w:t>
-      </w:r>
-      <w:proofErr w:type="spellStart"/>
-      <w:r>
-        <w:t>analyzer</w:t>
-      </w:r>
-      <w:proofErr w:type="spellEnd"/>
-      <w:r>
-        <w:t xml:space="preserve"> shape stories to the context gate's bar.</w:t>
+        <w:t xml:space="preserve">CONTEXT CLARIFICATION CHURN: the context gate stops at the first blocking set of ambiguities, so answering one layer can expose the next (OP018-6418 halted three times). Mitigated by BUILT #8 (one-pass rule) and BUILT #16–#19 (resume re-reads the story, earlier questions carried forward, answers recorded and reused). Not yet measured in CI — watch harness_report.py's CLARIFICATIONS block.</w:t>
       </w:r>
     </w:p>
     <w:p>
@@ -3516,15 +2235,7 @@
         </w:numPr>
       </w:pPr>
       <w:r>
-        <w:t xml:space="preserve">AUTH / SDK ERRORS MISREPORTED IN CONTEXT: a model-call auth failure (e.g. the classic-PAT 400) during context is reported as status </w:t>
-      </w:r>
-      <w:proofErr w:type="spellStart"/>
-      <w:r>
-        <w:t>needs_input</w:t>
-      </w:r>
-      <w:proofErr w:type="spellEnd"/>
-      <w:r>
-        <w:t xml:space="preserve"> with "NEEDS_CLARIFICATION — no context file produced", not as a CONFIG_ERROR halt. Developers can mistake it for a story problem. Engine fix pending.</w:t>
+        <w:t xml:space="preserve">FIXED: auth / SDK errors in context halt as SDK_ERROR (4af308a); no context file halts as artifact_missing (BUILT #17).</w:t>
       </w:r>
     </w:p>
     <w:p>
@@ -3535,23 +2246,7 @@
         </w:numPr>
       </w:pPr>
       <w:r>
-        <w:t xml:space="preserve">copilot-instructions.md in </w:t>
-      </w:r>
-      <w:proofErr w:type="spellStart"/>
-      <w:r>
-        <w:t>dx_mex</w:t>
-      </w:r>
-      <w:proofErr w:type="spellEnd"/>
-      <w:r>
-        <w:t xml:space="preserve">-coverage-service: earlier notes disagree on whether the file exists — confirm. A context attempt to ls it was denied by the write-boundary interlock. UNVERIFIED whether the file (when present) reaches phase context by any path; if not, that is a gap. Inferred: it would not have prevented OP018-6418's story-intent </w:t>
-      </w:r>
-      <w:proofErr w:type="gramStart"/>
-      <w:r>
-        <w:t>clarifications, but</w:t>
-      </w:r>
-      <w:proofErr w:type="gramEnd"/>
-      <w:r>
-        <w:t xml:space="preserve"> likely suppresses build / layering / test-convention questions.</w:t>
+        <w:t xml:space="preserve">copilot-instructions.md in dx_mex-coverage-service: existence unconfirmed. From BUILT #19/#20 the harness inlines it when present and creates it (repo_instructions phase) when missing, so the gap closes on the first run of the new engine.</w:t>
       </w:r>
     </w:p>
     <w:p>
@@ -3574,15 +2269,7 @@
       </w:pPr>
       <w:r>
         <w:lastRenderedPageBreak/>
-        <w:t>gpt-5.4 is ~10x the per-run cost of gpt-5-mini; pick per-phase models with cost in mind (e.g. cheaper model for context/</w:t>
-      </w:r>
-      <w:proofErr w:type="spellStart"/>
-      <w:r>
-        <w:t>prompt_steps</w:t>
-      </w:r>
-      <w:proofErr w:type="spellEnd"/>
-      <w:r>
-        <w:t>). Context is the highest-VOLUME phase in real repos, so a strong model there costs the most.</w:t>
+        <w:t>gpt-5.4 is ~10x the per-run cost of gpt-5-mini; pick per-phase models with cost in mind (e.g. cheaper model for context/prompt_steps). Context is the highest-VOLUME phase in real repos, so a strong model there costs the most.</w:t>
       </w:r>
     </w:p>
     <w:p>
@@ -3605,6 +2292,28 @@
       </w:pPr>
       <w:r>
         <w:t xml:space="preserve">test_state_machine.py has 7 pre-existing failures (e.g. code_review / unit_testing reported as having no task prompt); unrelated to #9–#15, not yet investigated.</w:t>
+      </w:r>
+    </w:p>
+    <w:p>
+      <w:pPr>
+        <w:numPr>
+          <w:ilvl w:val="0"/>
+          <w:numId w:val="13"/>
+        </w:numPr>
+      </w:pPr>
+      <w:r>
+        <w:t xml:space="preserve">Learning works per service repo: a rule recorded in one service is not loaded by another. Cross-service rules belong in the toolkit (toolkit_proposals). Answer/question matching and the service/story-only call are model judgements, caught by PR review.</w:t>
+      </w:r>
+    </w:p>
+    <w:p>
+      <w:pPr>
+        <w:numPr>
+          <w:ilvl w:val="0"/>
+          <w:numId w:val="13"/>
+        </w:numPr>
+      </w:pPr>
+      <w:r>
+        <w:t xml:space="preserve">A rule reaches later stories only after the harness PR that carries it is MERGED into the base branch those stories run against.</w:t>
       </w:r>
     </w:p>
     <w:p>
@@ -3630,55 +2339,7 @@
         </w:numPr>
       </w:pPr>
       <w:r>
-        <w:t>Replace placeholders: YOUR-ORG, YOUR-TOOLKIT-REPO, the caller's reusable-workflow reference (uses: &lt;org&gt;/&lt;engine&gt;/.</w:t>
-      </w:r>
-      <w:proofErr w:type="spellStart"/>
-      <w:r>
-        <w:t>github</w:t>
-      </w:r>
-      <w:proofErr w:type="spellEnd"/>
-      <w:r>
-        <w:t xml:space="preserve">/workflows/harness.yml@v1), </w:t>
-      </w:r>
-      <w:proofErr w:type="spellStart"/>
-      <w:r>
-        <w:t>engine_repo</w:t>
-      </w:r>
-      <w:proofErr w:type="spellEnd"/>
-      <w:r>
-        <w:t xml:space="preserve"> / </w:t>
-      </w:r>
-      <w:proofErr w:type="spellStart"/>
-      <w:r>
-        <w:t>toolkit_repo</w:t>
-      </w:r>
-      <w:proofErr w:type="spellEnd"/>
-      <w:r>
-        <w:t xml:space="preserve"> / </w:t>
-      </w:r>
-      <w:proofErr w:type="spellStart"/>
-      <w:r>
-        <w:t>toolkit_ref</w:t>
-      </w:r>
-      <w:proofErr w:type="spellEnd"/>
-      <w:r>
-        <w:t xml:space="preserve"> in the caller </w:t>
-      </w:r>
-      <w:proofErr w:type="gramStart"/>
-      <w:r>
-        <w:t>with:,</w:t>
-      </w:r>
-      <w:proofErr w:type="gramEnd"/>
-      <w:r>
-        <w:t xml:space="preserve"> and .harness/</w:t>
-      </w:r>
-      <w:proofErr w:type="spellStart"/>
-      <w:r>
-        <w:t>config.yaml</w:t>
-      </w:r>
-      <w:proofErr w:type="spellEnd"/>
-      <w:r>
-        <w:t xml:space="preserve"> values.</w:t>
+        <w:t xml:space="preserve">Replace placeholders: YOUR-ORG, YOUR-TOOLKIT-REPO, the caller's reusable-workflow reference (uses: &lt;org&gt;/&lt;engine&gt;/.github/workflows/harness.yml@v1), engine_repo / toolkit_repo / toolkit_ref in the caller with:, and .harness/config.yaml values.</w:t>
       </w:r>
     </w:p>
     <w:p>
@@ -3733,15 +2394,7 @@
         </w:numPr>
       </w:pPr>
       <w:r>
-        <w:t xml:space="preserve">Repo access (checkout of engine + toolkit, git push, </w:t>
-      </w:r>
-      <w:proofErr w:type="spellStart"/>
-      <w:r>
-        <w:t>gh</w:t>
-      </w:r>
-      <w:proofErr w:type="spellEnd"/>
-      <w:r>
-        <w:t xml:space="preserve"> pr create, billing API): COPILOT_GITHUB_TOKEN. A classic PAT is acceptable here. Needed for the ENGINE checkout too whenever the engine repo is private (it is at BCBSM).</w:t>
+        <w:t xml:space="preserve">Repo access (checkout of engine + toolkit, git push, gh pr create, billing API): COPILOT_GITHUB_TOKEN. A classic PAT is acceptable here. Needed for the ENGINE checkout too whenever the engine repo is private (it is at BCBSM).</w:t>
       </w:r>
     </w:p>
     <w:p>
@@ -3763,31 +2416,7 @@
         </w:numPr>
       </w:pPr>
       <w:r>
-        <w:t>A CLASSIC PAT IS NOT ACCEPTED for model calls — Copilot rejects it with "Personal Access Tokens are not supported for this endpoint". Supported kinds: OAuth (</w:t>
-      </w:r>
-      <w:proofErr w:type="spellStart"/>
-      <w:r>
-        <w:t>gho</w:t>
-      </w:r>
-      <w:proofErr w:type="spellEnd"/>
-      <w:r>
-        <w:t>_), GitHub App user (</w:t>
-      </w:r>
-      <w:proofErr w:type="spellStart"/>
-      <w:r>
-        <w:t>ghu</w:t>
-      </w:r>
-      <w:proofErr w:type="spellEnd"/>
-      <w:r>
-        <w:t>_), fine-grained PAT with the Copilot Requests permission, and the Actions token (</w:t>
-      </w:r>
-      <w:proofErr w:type="spellStart"/>
-      <w:r>
-        <w:t>ghs</w:t>
-      </w:r>
-      <w:proofErr w:type="spellEnd"/>
-      <w:r>
-        <w:t>_).</w:t>
+        <w:t>A CLASSIC PAT IS NOT ACCEPTED for model calls — Copilot rejects it with "Personal Access Tokens are not supported for this endpoint". Supported kinds: OAuth (gho_), GitHub App user (ghu_), fine-grained PAT with the Copilot Requests permission, and the Actions token (ghs_).</w:t>
       </w:r>
     </w:p>
     <w:p>
@@ -3809,47 +2438,7 @@
         </w:numPr>
       </w:pPr>
       <w:r>
-        <w:t xml:space="preserve">MODEL-TOKEN PRECEDENCE (verified in sdk_runner.py; identical at bb6a5bd and current v1): COPILOT_MODEL_TOKEN -&gt; COPILOT_GITHUB_TOKEN -&gt; GITHUB_TOKEN. Because the workflow always exports COPILOT_GITHUB_TOKEN (the classic PAT), the engine workflow MUST set COPILOT_MODEL_TOKEN: ${{ </w:t>
-      </w:r>
-      <w:proofErr w:type="spellStart"/>
-      <w:r>
-        <w:t>secrets.COPILOT_MODEL_TOKEN</w:t>
-      </w:r>
-      <w:proofErr w:type="spellEnd"/>
-      <w:r>
-        <w:t xml:space="preserve"> || </w:t>
-      </w:r>
-      <w:proofErr w:type="spellStart"/>
-      <w:r>
-        <w:t>github.token</w:t>
-      </w:r>
-      <w:proofErr w:type="spellEnd"/>
-      <w:r>
-        <w:t xml:space="preserve"> }} on every step that runs the engine. If it is missing, the classic PAT silently becomes the model </w:t>
-      </w:r>
-      <w:proofErr w:type="gramStart"/>
-      <w:r>
-        <w:t>credential</w:t>
-      </w:r>
-      <w:proofErr w:type="gramEnd"/>
-      <w:r>
-        <w:t xml:space="preserve"> and the first phase fails with the "Personal Access Tokens are not supported" 400. The log line [auth] copilot </w:t>
-      </w:r>
-      <w:proofErr w:type="gramStart"/>
-      <w:r>
-        <w:t>credential:</w:t>
-      </w:r>
-      <w:proofErr w:type="gramEnd"/>
-      <w:r>
-        <w:t xml:space="preserve"> shows which kind was used — expect </w:t>
-      </w:r>
-      <w:proofErr w:type="spellStart"/>
-      <w:r>
-        <w:t>ghs</w:t>
-      </w:r>
-      <w:proofErr w:type="spellEnd"/>
-      <w:r>
-        <w:t>_.</w:t>
+        <w:t xml:space="preserve">MODEL-TOKEN PRECEDENCE (verified in sdk_runner.py; identical at bb6a5bd and current v1): COPILOT_MODEL_TOKEN -&gt; COPILOT_GITHUB_TOKEN -&gt; GITHUB_TOKEN. Because the workflow always exports COPILOT_GITHUB_TOKEN (the classic PAT), the engine workflow MUST set COPILOT_MODEL_TOKEN: ${{ secrets.COPILOT_MODEL_TOKEN || github.token }} on every step that runs the engine. If it is missing, the classic PAT silently becomes the model credential and the first phase fails with the "Personal Access Tokens are not supported" 400. The log line [auth] copilot credential: shows which kind was used — expect ghs_.</w:t>
       </w:r>
     </w:p>
     <w:p>
@@ -3872,71 +2461,7 @@
         </w:numPr>
       </w:pPr>
       <w:r>
-        <w:t xml:space="preserve">Build wrapper: the </w:t>
-      </w:r>
-      <w:proofErr w:type="spellStart"/>
-      <w:r>
-        <w:t>mvnw</w:t>
-      </w:r>
-      <w:proofErr w:type="spellEnd"/>
-      <w:r>
-        <w:t xml:space="preserve"> executable bit is handled on the runner by </w:t>
-      </w:r>
-      <w:proofErr w:type="spellStart"/>
-      <w:r>
-        <w:t>harness.yml</w:t>
-      </w:r>
-      <w:proofErr w:type="spellEnd"/>
-      <w:r>
-        <w:t xml:space="preserve"> (BUILT #7); a repo commit is no longer required. Still check CRLF line endings (git ls-files --</w:t>
-      </w:r>
-      <w:proofErr w:type="spellStart"/>
-      <w:r>
-        <w:t>eol</w:t>
-      </w:r>
-      <w:proofErr w:type="spellEnd"/>
-      <w:r>
-        <w:t xml:space="preserve"> </w:t>
-      </w:r>
-      <w:proofErr w:type="spellStart"/>
-      <w:r>
-        <w:t>mvnw</w:t>
-      </w:r>
-      <w:proofErr w:type="spellEnd"/>
-      <w:r>
-        <w:t xml:space="preserve"> should show </w:t>
-      </w:r>
-      <w:proofErr w:type="spellStart"/>
-      <w:r>
-        <w:t>i</w:t>
-      </w:r>
-      <w:proofErr w:type="spellEnd"/>
-      <w:r>
-        <w:t>/</w:t>
-      </w:r>
-      <w:proofErr w:type="spellStart"/>
-      <w:r>
-        <w:t>lf</w:t>
-      </w:r>
-      <w:proofErr w:type="spellEnd"/>
-      <w:r>
-        <w:t>) and that .</w:t>
-      </w:r>
-      <w:proofErr w:type="spellStart"/>
-      <w:r>
-        <w:t>mvn</w:t>
-      </w:r>
-      <w:proofErr w:type="spellEnd"/>
-      <w:r>
-        <w:t xml:space="preserve">/wrapper/ is committed — </w:t>
-      </w:r>
-      <w:proofErr w:type="gramStart"/>
-      <w:r>
-        <w:t>either also</w:t>
-      </w:r>
-      <w:proofErr w:type="gramEnd"/>
-      <w:r>
-        <w:t xml:space="preserve"> causes exit 126.</w:t>
+        <w:t xml:space="preserve">Build wrapper: the mvnw executable bit is handled on the runner by harness.yml (BUILT #7); a repo commit is no longer required. Still check CRLF line endings (git ls-files --eol mvnw should show i/lf) and that .mvn/wrapper/ is committed — either also causes exit 126.</w:t>
       </w:r>
     </w:p>
     <w:p>
@@ -3947,23 +2472,7 @@
         </w:numPr>
       </w:pPr>
       <w:r>
-        <w:t>Add the SERVICE REPO .</w:t>
-      </w:r>
-      <w:proofErr w:type="spellStart"/>
-      <w:r>
-        <w:t>gitignore</w:t>
-      </w:r>
-      <w:proofErr w:type="spellEnd"/>
-      <w:r>
-        <w:t xml:space="preserve"> entries (.harness/*, !.harness/</w:t>
-      </w:r>
-      <w:proofErr w:type="spellStart"/>
-      <w:r>
-        <w:t>config.yaml</w:t>
-      </w:r>
-      <w:proofErr w:type="spellEnd"/>
-      <w:r>
-        <w:t>, audit/, metrics/) — see that section above.</w:t>
+        <w:t xml:space="preserve">Add the SERVICE REPO .gitignore entries (.harness/*, !.harness/config.yaml, audit/, metrics/) — see that section above.</w:t>
       </w:r>
     </w:p>
     <w:p>
@@ -3974,39 +2483,7 @@
         </w:numPr>
       </w:pPr>
       <w:r>
-        <w:t xml:space="preserve">Sync the WHOLE harness/ folder when updating a client engine clone, not individual files, then run an import check (inside harness/) before re-tagging: python -c "import run, executor, </w:t>
-      </w:r>
-      <w:proofErr w:type="spellStart"/>
-      <w:r>
-        <w:t>state_machine</w:t>
-      </w:r>
-      <w:proofErr w:type="spellEnd"/>
-      <w:r>
-        <w:t xml:space="preserve">, </w:t>
-      </w:r>
-      <w:proofErr w:type="spellStart"/>
-      <w:r>
-        <w:t>sdk_runner</w:t>
-      </w:r>
-      <w:proofErr w:type="spellEnd"/>
-      <w:r>
-        <w:t xml:space="preserve">, </w:t>
-      </w:r>
-      <w:proofErr w:type="spellStart"/>
-      <w:r>
-        <w:t>execution_record</w:t>
-      </w:r>
-      <w:proofErr w:type="spellEnd"/>
-      <w:r>
-        <w:t xml:space="preserve">" (A partial file copy that omitted execution_record.py caused a </w:t>
-      </w:r>
-      <w:proofErr w:type="spellStart"/>
-      <w:r>
-        <w:t>ModuleNotFoundError</w:t>
-      </w:r>
-      <w:proofErr w:type="spellEnd"/>
-      <w:r>
-        <w:t xml:space="preserve"> mid-run at BCBSM.)</w:t>
+        <w:t xml:space="preserve">Sync the WHOLE harness/ folder when updating a client engine clone, not individual files, then run an import check (inside harness/) before re-tagging: python -c "import run, executor, state_machine, sdk_runner, execution_record" (A partial file copy that omitted execution_record.py caused a ModuleNotFoundError mid-run at BCBSM.)</w:t>
       </w:r>
     </w:p>
     <w:p>
@@ -4017,39 +2494,7 @@
         </w:numPr>
       </w:pPr>
       <w:r>
-        <w:t>MOVING THE v1 TAG CHANGES THE WORKFLOW TOO, not just the engine code: the caller runs harness.yml@v1. Before re-tagging, check git log --</w:t>
-      </w:r>
-      <w:proofErr w:type="spellStart"/>
-      <w:r>
-        <w:t>oneline</w:t>
-      </w:r>
-      <w:proofErr w:type="spellEnd"/>
-      <w:r>
-        <w:t xml:space="preserve"> v</w:t>
-      </w:r>
-      <w:proofErr w:type="gramStart"/>
-      <w:r>
-        <w:t>1..</w:t>
-      </w:r>
-      <w:proofErr w:type="gramEnd"/>
-      <w:r>
-        <w:t>master git diff v1 master -- .</w:t>
-      </w:r>
-      <w:proofErr w:type="spellStart"/>
-      <w:r>
-        <w:t>github</w:t>
-      </w:r>
-      <w:proofErr w:type="spellEnd"/>
-      <w:r>
-        <w:t>/workflows/</w:t>
-      </w:r>
-      <w:proofErr w:type="spellStart"/>
-      <w:r>
-        <w:t>harness.yml</w:t>
-      </w:r>
-      <w:proofErr w:type="spellEnd"/>
-      <w:r>
-        <w:t xml:space="preserve"> for lost client wiring (checkout token, copilot-requests, COPILOT_MODEL_TOKEN, repo inputs). Moving v1 affects every repo calling @v1 from its next run — tell the other pilot developers. Tag force-push can be blocked by tag-protection rules separately from branch protection. A tag may point at a non-master commit for testing; re-tag to master after the PR merges.</w:t>
+        <w:t xml:space="preserve">MOVING THE v1 TAG CHANGES THE WORKFLOW TOO, not just the engine code: the caller runs harness.yml@v1. Before re-tagging, check git log --oneline v1..master git diff v1 master -- .github/workflows/harness.yml for lost client wiring (checkout token, copilot-requests, COPILOT_MODEL_TOKEN, repo inputs). Moving v1 affects every repo calling @v1 from its next run — tell the other pilot developers. Tag force-push can be blocked by tag-protection rules separately from branch protection. A tag may point at a non-master commit for testing; re-tag to master after the PR merges.</w:t>
       </w:r>
     </w:p>
     <w:p>
@@ -4107,21 +2552,8 @@
           <w:numId w:val="15"/>
         </w:numPr>
       </w:pPr>
-      <w:proofErr w:type="gramStart"/>
-      <w:r>
-        <w:t>Fully-commented</w:t>
-      </w:r>
-      <w:proofErr w:type="gramEnd"/>
-      <w:r>
-        <w:t xml:space="preserve"> service .harness/</w:t>
-      </w:r>
-      <w:proofErr w:type="spellStart"/>
-      <w:r>
-        <w:t>config.yaml</w:t>
-      </w:r>
-      <w:proofErr w:type="spellEnd"/>
-      <w:r>
-        <w:t xml:space="preserve"> (source of truth for settings).</w:t>
+      <w:r>
+        <w:t xml:space="preserve">Fully-commented service .harness/config.yaml (source of truth for settings).</w:t>
       </w:r>
     </w:p>
     <w:p>
@@ -4143,31 +2575,7 @@
         </w:numPr>
       </w:pPr>
       <w:r>
-        <w:t>harness-change-</w:t>
-      </w:r>
-      <w:proofErr w:type="spellStart"/>
-      <w:r>
-        <w:t>analyzer</w:t>
-      </w:r>
-      <w:proofErr w:type="spellEnd"/>
-      <w:r>
-        <w:t xml:space="preserve"> story spec (how the upstream </w:t>
-      </w:r>
-      <w:proofErr w:type="spellStart"/>
-      <w:r>
-        <w:t>analyzer</w:t>
-      </w:r>
-      <w:proofErr w:type="spellEnd"/>
-      <w:r>
-        <w:t xml:space="preserve"> must shape </w:t>
-      </w:r>
-      <w:proofErr w:type="gramStart"/>
-      <w:r>
-        <w:t>stories</w:t>
-      </w:r>
-      <w:proofErr w:type="gramEnd"/>
-      <w:r>
-        <w:t xml:space="preserve"> so context accepts them: zero [NEEDS CLARIFICATION], GO).</w:t>
+        <w:t xml:space="preserve">harness-change-analyzer story spec (how the upstream analyzer must shape stories so context accepts them: zero [NEEDS CLARIFICATION], GO).</w:t>
       </w:r>
     </w:p>
     <w:p>
@@ -4190,6 +2598,28 @@
       </w:pPr>
       <w:r>
         <w:t xml:space="preserve">maven-libs README + publish.sh / capture.sh.</w:t>
+      </w:r>
+    </w:p>
+    <w:p>
+      <w:pPr>
+        <w:numPr>
+          <w:ilvl w:val="0"/>
+          <w:numId w:val="15"/>
+        </w:numPr>
+      </w:pPr>
+      <w:r>
+        <w:t xml:space="preserve">Review of Perplexity's "Reducing Clarification Churn" recommendation (2026-10-10, in chat).</w:t>
+      </w:r>
+    </w:p>
+    <w:p>
+      <w:pPr>
+        <w:numPr>
+          <w:ilvl w:val="0"/>
+          <w:numId w:val="15"/>
+        </w:numPr>
+      </w:pPr>
+      <w:r>
+        <w:t xml:space="preserve">Updated service caller workflow + config.yaml: docs/examples/SDLC-Harness.yml, docs/examples/config.yaml.</w:t>
       </w:r>
     </w:p>
     <w:p>

</xml_diff>

<commit_message>
Status note: re-run PR approved (2026-10-27); frontend support merged as PR #16
Co-Authored-By: Claude Opus 5.5 <noreply@anthropic.com>
Claude-Session: https://claude.ai/code/session_01YNVrNgGQaRbbfSVP5tjyXW
</commit_message>
<xml_diff>
--- a/docs/HARNESS_ENGINEERING_CURRENT_STATE_KEY_DECISIONS.docx
+++ b/docs/HARNESS_ENGINEERING_CURRENT_STATE_KEY_DECISIONS.docx
@@ -132,7 +132,7 @@
           <w:b/>
           <w:bCs/>
         </w:rPr>
-        <w:t xml:space="preserve">===================================================================== CURRENT STATE (updated 2026-10-25 — first full green run at BCBSM; review fixes; frontend next)</w:t>
+        <w:t xml:space="preserve">===================================================================== CURRENT STATE (updated 2026-10-27 — re-run PR approved; frontend support merged; frontend next)</w:t>
       </w:r>
     </w:p>
     <w:p>
@@ -147,7 +147,7 @@
           <w:b/>
           <w:bCs/>
         </w:rPr>
-        <w:t xml:space="preserve">2026-10-25 RE-RUN OF OP018-6418 with the contract/type rules (BUILT #31) applied by hand to the BCBSM toolkit and engine: no existing signature was changed. One test-compile loop (a long passed to a String setter) was fixed on the next pass; resume dossier and coverage gate worked (100% changed-class coverage). PR with the developer for review.</w:t>
+        <w:t xml:space="preserve">2026-10-25 RE-RUN OF OP018-6418 with the contract/type rules (BUILT #31) applied by hand to the BCBSM toolkit and engine: no existing signature was changed. One test-compile loop (a long passed to a String setter) was fixed on the next pass; resume dossier and coverage gate worked (100% changed-class coverage). 2026-10-27: the developer approved the PR for merging; the existing service response was not changed.</w:t>
       </w:r>
     </w:p>
     <w:p>
@@ -169,7 +169,7 @@
         </w:numPr>
       </w:pPr>
       <w:r>
-        <w:t xml:space="preserve">NEXT — Story 3 (dx_mycoverage-ui, Angular): repo available; Story 2 (dx_mpa_responsive) repo not yet. Plan: run Story 3 up to the context phase so the harness asks its clarification questions (store shape, status display), pass them to the developer, then resume. A full frontend run is blocked by the engine's Java-only write paths (OPEN DECISIONS / BACKLOG B4).</w:t>
+        <w:t xml:space="preserve">NEXT — Story 3 (dx_mycoverage-ui, Angular): repo available; Story 2 (dx_mpa_responsive) repo not yet. Plan: run Story 3 up to the context phase so the harness asks its clarification questions (store shape, status display), pass them to the developer, then resume. Frontend engine support (#32–#33) is merged in the personal repo (PR #16); sync it to BCBSM/dx_SDLC-Harness first (docs/bcbsm-sync/2026-10-25-frontend-support.md).</w:t>
       </w:r>
     </w:p>
     <w:p>
@@ -1388,7 +1388,7 @@
           <w:b/>
           <w:bCs/>
         </w:rPr>
-        <w:t xml:space="preserve">===================================================================== SHIPPED — BUILT #32–#33 FRONTEND SUPPORT (2026-10-25; SDLC-Harness PR, not yet run in CI)</w:t>
+        <w:t xml:space="preserve">===================================================================== SHIPPED — BUILT #32–#33 FRONTEND SUPPORT (2026-10-25; merged to main as SDLC-Harness PR #16; not yet run in CI or synced to BCBSM)</w:t>
       </w:r>
     </w:p>
     <w:p>

</xml_diff>